<commit_message>
Identified any timing issues, missed milestones, or unrealistic deadlines from the authentication team's planned timeline.
</commit_message>
<xml_diff>
--- a/Iteration_2/Echo_Review/final_submission/Planning_Review_Authentication_Team.docx
+++ b/Iteration_2/Echo_Review/final_submission/Planning_Review_Authentication_Team.docx
@@ -17,7 +17,7 @@
           <w:szCs w:val="39"/>
           <w:rtl w:val="0"/>
         </w:rPr>
-        <w:t xml:space="preserve">Project Document Review: Authentication Team</w:t>
+        <w:t xml:space="preserve">Planning Document Review: Authentication Team</w:t>
       </w:r>
       <w:r>
         <w:pict>
@@ -36,19 +36,39 @@
         <w:rPr>
           <w:b w:val="1"/>
           <w:color w:val="3f6caf"/>
-          <w:sz w:val="20"/>
-          <w:szCs w:val="20"/>
-        </w:rPr>
-      </w:pPr>
-      <w:r>
-        <w:rPr>
-          <w:b w:val="1"/>
-          <w:color w:val="3f6caf"/>
-          <w:sz w:val="20"/>
-          <w:szCs w:val="20"/>
+          <w:sz w:val="24"/>
+          <w:szCs w:val="24"/>
+        </w:rPr>
+      </w:pPr>
+      <w:r>
+        <w:rPr>
+          <w:b w:val="1"/>
+          <w:color w:val="3f6caf"/>
+          <w:sz w:val="24"/>
+          <w:szCs w:val="24"/>
           <w:rtl w:val="0"/>
         </w:rPr>
         <w:t xml:space="preserve">1. Identification of Timing Issues</w:t>
+      </w:r>
+    </w:p>
+    <w:p>
+      <w:pPr>
+        <w:rPr>
+          <w:b w:val="1"/>
+          <w:color w:val="3f6caf"/>
+          <w:sz w:val="18"/>
+          <w:szCs w:val="18"/>
+        </w:rPr>
+      </w:pPr>
+      <w:r>
+        <w:rPr>
+          <w:b w:val="1"/>
+          <w:color w:val="3f6caf"/>
+          <w:sz w:val="18"/>
+          <w:szCs w:val="18"/>
+          <w:rtl w:val="0"/>
+        </w:rPr>
+        <w:t xml:space="preserve">1.1 Review of Planned Timeline and Milestones</w:t>
       </w:r>
     </w:p>
     <w:p>
@@ -62,45 +82,810 @@
       </w:pPr>
       <w:r>
         <w:rPr>
-          <w:b w:val="1"/>
-          <w:color w:val="3f6caf"/>
+          <w:rtl w:val="0"/>
+        </w:rPr>
+      </w:r>
+    </w:p>
+    <w:p>
+      <w:pPr>
+        <w:spacing w:after="160" w:lineRule="auto"/>
+        <w:rPr>
+          <w:color w:val="13284b"/>
           <w:sz w:val="17"/>
           <w:szCs w:val="17"/>
-          <w:rtl w:val="0"/>
-        </w:rPr>
-        <w:t xml:space="preserve">1.1 Review of Planned Timeline and Milestones</w:t>
-      </w:r>
-    </w:p>
-    <w:p>
-      <w:pPr>
-        <w:rPr>
-          <w:b w:val="1"/>
-          <w:color w:val="3f6caf"/>
+        </w:rPr>
+      </w:pPr>
+      <w:r>
+        <w:rPr>
+          <w:color w:val="13284b"/>
           <w:sz w:val="17"/>
           <w:szCs w:val="17"/>
-        </w:rPr>
-      </w:pPr>
-      <w:r>
-        <w:rPr>
-          <w:rtl w:val="0"/>
-        </w:rPr>
-      </w:r>
-    </w:p>
-    <w:p>
-      <w:pPr>
-        <w:rPr>
-          <w:b w:val="1"/>
-          <w:color w:val="3f6caf"/>
+          <w:rtl w:val="0"/>
+        </w:rPr>
+        <w:t xml:space="preserve">Use the table below to document and assess each task’s timeline based on the Planning Document:</w:t>
+      </w:r>
+    </w:p>
+    <w:tbl>
+      <w:tblPr>
+        <w:tblStyle w:val="Table1"/>
+        <w:tblW w:w="9285.0" w:type="dxa"/>
+        <w:jc w:val="left"/>
+        <w:tblBorders>
+          <w:top w:color="000000" w:space="0" w:sz="4" w:val="single"/>
+          <w:left w:color="000000" w:space="0" w:sz="4" w:val="single"/>
+          <w:bottom w:color="000000" w:space="0" w:sz="4" w:val="single"/>
+          <w:right w:color="000000" w:space="0" w:sz="4" w:val="single"/>
+          <w:insideH w:color="000000" w:space="0" w:sz="4" w:val="single"/>
+          <w:insideV w:color="000000" w:space="0" w:sz="4" w:val="single"/>
+        </w:tblBorders>
+        <w:tblLayout w:type="fixed"/>
+        <w:tblLook w:val="0600"/>
+      </w:tblPr>
+      <w:tblGrid>
+        <w:gridCol w:w="3120"/>
+        <w:gridCol w:w="2955"/>
+        <w:gridCol w:w="3210"/>
+        <w:tblGridChange w:id="0">
+          <w:tblGrid>
+            <w:gridCol w:w="3120"/>
+            <w:gridCol w:w="2955"/>
+            <w:gridCol w:w="3210"/>
+          </w:tblGrid>
+        </w:tblGridChange>
+      </w:tblGrid>
+      <w:tr>
+        <w:trPr>
+          <w:cantSplit w:val="0"/>
+          <w:trHeight w:val="465" w:hRule="atLeast"/>
+          <w:tblHeader w:val="0"/>
+        </w:trPr>
+        <w:tc>
+          <w:tcPr>
+            <w:tcBorders>
+              <w:top w:color="000000" w:space="0" w:sz="4" w:val="single"/>
+              <w:left w:color="000000" w:space="0" w:sz="4" w:val="single"/>
+              <w:bottom w:color="000000" w:space="0" w:sz="4" w:val="single"/>
+              <w:right w:color="000000" w:space="0" w:sz="4" w:val="single"/>
+            </w:tcBorders>
+            <w:tcMar>
+              <w:top w:w="60.0" w:type="dxa"/>
+              <w:left w:w="60.0" w:type="dxa"/>
+              <w:bottom w:w="60.0" w:type="dxa"/>
+              <w:right w:w="60.0" w:type="dxa"/>
+            </w:tcMar>
+            <w:vAlign w:val="top"/>
+          </w:tcPr>
+          <w:p>
+            <w:pPr>
+              <w:spacing w:after="160" w:lineRule="auto"/>
+              <w:jc w:val="center"/>
+              <w:rPr>
+                <w:color w:val="13284b"/>
+                <w:sz w:val="17"/>
+                <w:szCs w:val="17"/>
+              </w:rPr>
+            </w:pPr>
+            <w:r>
+              <w:rPr>
+                <w:color w:val="13284b"/>
+                <w:sz w:val="17"/>
+                <w:szCs w:val="17"/>
+                <w:rtl w:val="0"/>
+              </w:rPr>
+              <w:t xml:space="preserve">Task Description</w:t>
+            </w:r>
+          </w:p>
+        </w:tc>
+        <w:tc>
+          <w:tcPr>
+            <w:tcBorders>
+              <w:top w:color="000000" w:space="0" w:sz="4" w:val="single"/>
+              <w:left w:color="000000" w:space="0" w:sz="4" w:val="single"/>
+              <w:bottom w:color="000000" w:space="0" w:sz="4" w:val="single"/>
+              <w:right w:color="000000" w:space="0" w:sz="4" w:val="single"/>
+            </w:tcBorders>
+            <w:tcMar>
+              <w:top w:w="60.0" w:type="dxa"/>
+              <w:left w:w="60.0" w:type="dxa"/>
+              <w:bottom w:w="60.0" w:type="dxa"/>
+              <w:right w:w="60.0" w:type="dxa"/>
+            </w:tcMar>
+            <w:vAlign w:val="top"/>
+          </w:tcPr>
+          <w:p>
+            <w:pPr>
+              <w:spacing w:after="160" w:lineRule="auto"/>
+              <w:jc w:val="center"/>
+              <w:rPr>
+                <w:color w:val="13284b"/>
+                <w:sz w:val="17"/>
+                <w:szCs w:val="17"/>
+              </w:rPr>
+            </w:pPr>
+            <w:r>
+              <w:rPr>
+                <w:color w:val="13284b"/>
+                <w:sz w:val="17"/>
+                <w:szCs w:val="17"/>
+                <w:rtl w:val="0"/>
+              </w:rPr>
+              <w:t xml:space="preserve">Planned Start</w:t>
+            </w:r>
+          </w:p>
+        </w:tc>
+        <w:tc>
+          <w:tcPr>
+            <w:tcBorders>
+              <w:top w:color="000000" w:space="0" w:sz="4" w:val="single"/>
+              <w:left w:color="000000" w:space="0" w:sz="4" w:val="single"/>
+              <w:bottom w:color="000000" w:space="0" w:sz="4" w:val="single"/>
+              <w:right w:color="000000" w:space="0" w:sz="4" w:val="single"/>
+            </w:tcBorders>
+            <w:tcMar>
+              <w:top w:w="60.0" w:type="dxa"/>
+              <w:left w:w="60.0" w:type="dxa"/>
+              <w:bottom w:w="60.0" w:type="dxa"/>
+              <w:right w:w="60.0" w:type="dxa"/>
+            </w:tcMar>
+            <w:vAlign w:val="top"/>
+          </w:tcPr>
+          <w:p>
+            <w:pPr>
+              <w:spacing w:after="160" w:lineRule="auto"/>
+              <w:jc w:val="center"/>
+              <w:rPr>
+                <w:color w:val="13284b"/>
+                <w:sz w:val="17"/>
+                <w:szCs w:val="17"/>
+              </w:rPr>
+            </w:pPr>
+            <w:r>
+              <w:rPr>
+                <w:color w:val="13284b"/>
+                <w:sz w:val="17"/>
+                <w:szCs w:val="17"/>
+                <w:rtl w:val="0"/>
+              </w:rPr>
+              <w:t xml:space="preserve">Planned End</w:t>
+            </w:r>
+          </w:p>
+        </w:tc>
+      </w:tr>
+      <w:tr>
+        <w:trPr>
+          <w:cantSplit w:val="0"/>
+          <w:trHeight w:val="840" w:hRule="atLeast"/>
+          <w:tblHeader w:val="0"/>
+        </w:trPr>
+        <w:tc>
+          <w:tcPr>
+            <w:tcBorders>
+              <w:top w:color="000000" w:space="0" w:sz="4" w:val="single"/>
+              <w:left w:color="000000" w:space="0" w:sz="4" w:val="single"/>
+              <w:bottom w:color="000000" w:space="0" w:sz="4" w:val="single"/>
+              <w:right w:color="000000" w:space="0" w:sz="4" w:val="single"/>
+            </w:tcBorders>
+            <w:tcMar>
+              <w:top w:w="60.0" w:type="dxa"/>
+              <w:left w:w="60.0" w:type="dxa"/>
+              <w:bottom w:w="60.0" w:type="dxa"/>
+              <w:right w:w="60.0" w:type="dxa"/>
+            </w:tcMar>
+            <w:vAlign w:val="top"/>
+          </w:tcPr>
+          <w:p>
+            <w:pPr>
+              <w:spacing w:after="160" w:lineRule="auto"/>
+              <w:jc w:val="center"/>
+              <w:rPr>
+                <w:color w:val="13284b"/>
+                <w:sz w:val="17"/>
+                <w:szCs w:val="17"/>
+              </w:rPr>
+            </w:pPr>
+            <w:r>
+              <w:rPr>
+                <w:color w:val="13284b"/>
+                <w:sz w:val="17"/>
+                <w:szCs w:val="17"/>
+                <w:rtl w:val="0"/>
+              </w:rPr>
+              <w:t xml:space="preserve">Initial Class Code Implementation</w:t>
+            </w:r>
+          </w:p>
+        </w:tc>
+        <w:tc>
+          <w:tcPr>
+            <w:tcBorders>
+              <w:top w:color="000000" w:space="0" w:sz="4" w:val="single"/>
+              <w:left w:color="000000" w:space="0" w:sz="4" w:val="single"/>
+              <w:bottom w:color="000000" w:space="0" w:sz="4" w:val="single"/>
+              <w:right w:color="000000" w:space="0" w:sz="4" w:val="single"/>
+            </w:tcBorders>
+            <w:tcMar>
+              <w:top w:w="60.0" w:type="dxa"/>
+              <w:left w:w="60.0" w:type="dxa"/>
+              <w:bottom w:w="60.0" w:type="dxa"/>
+              <w:right w:w="60.0" w:type="dxa"/>
+            </w:tcMar>
+            <w:vAlign w:val="top"/>
+          </w:tcPr>
+          <w:p>
+            <w:pPr>
+              <w:spacing w:after="160" w:lineRule="auto"/>
+              <w:jc w:val="center"/>
+              <w:rPr>
+                <w:color w:val="13284b"/>
+                <w:sz w:val="17"/>
+                <w:szCs w:val="17"/>
+              </w:rPr>
+            </w:pPr>
+            <w:r>
+              <w:rPr>
+                <w:color w:val="13284b"/>
+                <w:sz w:val="17"/>
+                <w:szCs w:val="17"/>
+                <w:rtl w:val="0"/>
+              </w:rPr>
+              <w:t xml:space="preserve">Nov 7</w:t>
+            </w:r>
+          </w:p>
+        </w:tc>
+        <w:tc>
+          <w:tcPr>
+            <w:tcBorders>
+              <w:top w:color="000000" w:space="0" w:sz="4" w:val="single"/>
+              <w:left w:color="000000" w:space="0" w:sz="4" w:val="single"/>
+              <w:bottom w:color="000000" w:space="0" w:sz="4" w:val="single"/>
+              <w:right w:color="000000" w:space="0" w:sz="4" w:val="single"/>
+            </w:tcBorders>
+            <w:tcMar>
+              <w:top w:w="60.0" w:type="dxa"/>
+              <w:left w:w="60.0" w:type="dxa"/>
+              <w:bottom w:w="60.0" w:type="dxa"/>
+              <w:right w:w="60.0" w:type="dxa"/>
+            </w:tcMar>
+            <w:vAlign w:val="top"/>
+          </w:tcPr>
+          <w:p>
+            <w:pPr>
+              <w:spacing w:after="160" w:lineRule="auto"/>
+              <w:jc w:val="center"/>
+              <w:rPr>
+                <w:color w:val="13284b"/>
+                <w:sz w:val="17"/>
+                <w:szCs w:val="17"/>
+              </w:rPr>
+            </w:pPr>
+            <w:r>
+              <w:rPr>
+                <w:color w:val="13284b"/>
+                <w:sz w:val="17"/>
+                <w:szCs w:val="17"/>
+                <w:rtl w:val="0"/>
+              </w:rPr>
+              <w:t xml:space="preserve">Nov 8</w:t>
+            </w:r>
+          </w:p>
+        </w:tc>
+      </w:tr>
+      <w:tr>
+        <w:trPr>
+          <w:cantSplit w:val="0"/>
+          <w:trHeight w:val="1020" w:hRule="atLeast"/>
+          <w:tblHeader w:val="0"/>
+        </w:trPr>
+        <w:tc>
+          <w:tcPr>
+            <w:tcBorders>
+              <w:top w:color="000000" w:space="0" w:sz="4" w:val="single"/>
+              <w:left w:color="000000" w:space="0" w:sz="4" w:val="single"/>
+              <w:bottom w:color="000000" w:space="0" w:sz="4" w:val="single"/>
+              <w:right w:color="000000" w:space="0" w:sz="4" w:val="single"/>
+            </w:tcBorders>
+            <w:tcMar>
+              <w:top w:w="60.0" w:type="dxa"/>
+              <w:left w:w="60.0" w:type="dxa"/>
+              <w:bottom w:w="60.0" w:type="dxa"/>
+              <w:right w:w="60.0" w:type="dxa"/>
+            </w:tcMar>
+            <w:vAlign w:val="top"/>
+          </w:tcPr>
+          <w:p>
+            <w:pPr>
+              <w:spacing w:after="160" w:lineRule="auto"/>
+              <w:jc w:val="center"/>
+              <w:rPr>
+                <w:color w:val="13284b"/>
+                <w:sz w:val="17"/>
+                <w:szCs w:val="17"/>
+              </w:rPr>
+            </w:pPr>
+            <w:r>
+              <w:rPr>
+                <w:color w:val="13284b"/>
+                <w:sz w:val="17"/>
+                <w:szCs w:val="17"/>
+                <w:rtl w:val="0"/>
+              </w:rPr>
+              <w:t xml:space="preserve">Test Class Creation (Reading Week)</w:t>
+            </w:r>
+          </w:p>
+        </w:tc>
+        <w:tc>
+          <w:tcPr>
+            <w:tcBorders>
+              <w:top w:color="000000" w:space="0" w:sz="4" w:val="single"/>
+              <w:left w:color="000000" w:space="0" w:sz="4" w:val="single"/>
+              <w:bottom w:color="000000" w:space="0" w:sz="4" w:val="single"/>
+              <w:right w:color="000000" w:space="0" w:sz="4" w:val="single"/>
+            </w:tcBorders>
+            <w:tcMar>
+              <w:top w:w="60.0" w:type="dxa"/>
+              <w:left w:w="60.0" w:type="dxa"/>
+              <w:bottom w:w="60.0" w:type="dxa"/>
+              <w:right w:w="60.0" w:type="dxa"/>
+            </w:tcMar>
+            <w:vAlign w:val="top"/>
+          </w:tcPr>
+          <w:p>
+            <w:pPr>
+              <w:spacing w:after="160" w:lineRule="auto"/>
+              <w:jc w:val="center"/>
+              <w:rPr>
+                <w:color w:val="13284b"/>
+                <w:sz w:val="17"/>
+                <w:szCs w:val="17"/>
+              </w:rPr>
+            </w:pPr>
+            <w:r>
+              <w:rPr>
+                <w:color w:val="13284b"/>
+                <w:sz w:val="17"/>
+                <w:szCs w:val="17"/>
+                <w:rtl w:val="0"/>
+              </w:rPr>
+              <w:t xml:space="preserve">Nov 11</w:t>
+            </w:r>
+          </w:p>
+        </w:tc>
+        <w:tc>
+          <w:tcPr>
+            <w:tcBorders>
+              <w:top w:color="000000" w:space="0" w:sz="4" w:val="single"/>
+              <w:left w:color="000000" w:space="0" w:sz="4" w:val="single"/>
+              <w:bottom w:color="000000" w:space="0" w:sz="4" w:val="single"/>
+              <w:right w:color="000000" w:space="0" w:sz="4" w:val="single"/>
+            </w:tcBorders>
+            <w:tcMar>
+              <w:top w:w="60.0" w:type="dxa"/>
+              <w:left w:w="60.0" w:type="dxa"/>
+              <w:bottom w:w="60.0" w:type="dxa"/>
+              <w:right w:w="60.0" w:type="dxa"/>
+            </w:tcMar>
+            <w:vAlign w:val="top"/>
+          </w:tcPr>
+          <w:p>
+            <w:pPr>
+              <w:spacing w:after="160" w:lineRule="auto"/>
+              <w:jc w:val="center"/>
+              <w:rPr>
+                <w:color w:val="13284b"/>
+                <w:sz w:val="17"/>
+                <w:szCs w:val="17"/>
+              </w:rPr>
+            </w:pPr>
+            <w:r>
+              <w:rPr>
+                <w:color w:val="13284b"/>
+                <w:sz w:val="17"/>
+                <w:szCs w:val="17"/>
+                <w:rtl w:val="0"/>
+              </w:rPr>
+              <w:t xml:space="preserve">Nov 17</w:t>
+            </w:r>
+          </w:p>
+        </w:tc>
+      </w:tr>
+      <w:tr>
+        <w:trPr>
+          <w:cantSplit w:val="0"/>
+          <w:trHeight w:val="1020" w:hRule="atLeast"/>
+          <w:tblHeader w:val="0"/>
+        </w:trPr>
+        <w:tc>
+          <w:tcPr>
+            <w:tcBorders>
+              <w:top w:color="000000" w:space="0" w:sz="4" w:val="single"/>
+              <w:left w:color="000000" w:space="0" w:sz="4" w:val="single"/>
+              <w:bottom w:color="000000" w:space="0" w:sz="4" w:val="single"/>
+              <w:right w:color="000000" w:space="0" w:sz="4" w:val="single"/>
+            </w:tcBorders>
+            <w:tcMar>
+              <w:top w:w="60.0" w:type="dxa"/>
+              <w:left w:w="60.0" w:type="dxa"/>
+              <w:bottom w:w="60.0" w:type="dxa"/>
+              <w:right w:w="60.0" w:type="dxa"/>
+            </w:tcMar>
+            <w:vAlign w:val="top"/>
+          </w:tcPr>
+          <w:p>
+            <w:pPr>
+              <w:spacing w:after="160" w:lineRule="auto"/>
+              <w:jc w:val="center"/>
+              <w:rPr>
+                <w:color w:val="13284b"/>
+                <w:sz w:val="17"/>
+                <w:szCs w:val="17"/>
+              </w:rPr>
+            </w:pPr>
+            <w:r>
+              <w:rPr>
+                <w:color w:val="13284b"/>
+                <w:sz w:val="17"/>
+                <w:szCs w:val="17"/>
+                <w:rtl w:val="0"/>
+              </w:rPr>
+              <w:t xml:space="preserve">Completion of Initial Code</w:t>
+            </w:r>
+          </w:p>
+        </w:tc>
+        <w:tc>
+          <w:tcPr>
+            <w:tcBorders>
+              <w:top w:color="000000" w:space="0" w:sz="4" w:val="single"/>
+              <w:left w:color="000000" w:space="0" w:sz="4" w:val="single"/>
+              <w:bottom w:color="000000" w:space="0" w:sz="4" w:val="single"/>
+              <w:right w:color="000000" w:space="0" w:sz="4" w:val="single"/>
+            </w:tcBorders>
+            <w:tcMar>
+              <w:top w:w="60.0" w:type="dxa"/>
+              <w:left w:w="60.0" w:type="dxa"/>
+              <w:bottom w:w="60.0" w:type="dxa"/>
+              <w:right w:w="60.0" w:type="dxa"/>
+            </w:tcMar>
+            <w:vAlign w:val="top"/>
+          </w:tcPr>
+          <w:p>
+            <w:pPr>
+              <w:spacing w:after="160" w:lineRule="auto"/>
+              <w:jc w:val="center"/>
+              <w:rPr>
+                <w:color w:val="13284b"/>
+                <w:sz w:val="17"/>
+                <w:szCs w:val="17"/>
+              </w:rPr>
+            </w:pPr>
+            <w:r>
+              <w:rPr>
+                <w:color w:val="13284b"/>
+                <w:sz w:val="17"/>
+                <w:szCs w:val="17"/>
+                <w:rtl w:val="0"/>
+              </w:rPr>
+              <w:t xml:space="preserve">Nov 18</w:t>
+            </w:r>
+          </w:p>
+        </w:tc>
+        <w:tc>
+          <w:tcPr>
+            <w:tcBorders>
+              <w:top w:color="000000" w:space="0" w:sz="4" w:val="single"/>
+              <w:left w:color="000000" w:space="0" w:sz="4" w:val="single"/>
+              <w:bottom w:color="000000" w:space="0" w:sz="4" w:val="single"/>
+              <w:right w:color="000000" w:space="0" w:sz="4" w:val="single"/>
+            </w:tcBorders>
+            <w:tcMar>
+              <w:top w:w="60.0" w:type="dxa"/>
+              <w:left w:w="60.0" w:type="dxa"/>
+              <w:bottom w:w="60.0" w:type="dxa"/>
+              <w:right w:w="60.0" w:type="dxa"/>
+            </w:tcMar>
+            <w:vAlign w:val="top"/>
+          </w:tcPr>
+          <w:p>
+            <w:pPr>
+              <w:spacing w:after="160" w:lineRule="auto"/>
+              <w:jc w:val="center"/>
+              <w:rPr>
+                <w:color w:val="13284b"/>
+                <w:sz w:val="17"/>
+                <w:szCs w:val="17"/>
+              </w:rPr>
+            </w:pPr>
+            <w:r>
+              <w:rPr>
+                <w:color w:val="13284b"/>
+                <w:sz w:val="17"/>
+                <w:szCs w:val="17"/>
+                <w:rtl w:val="0"/>
+              </w:rPr>
+              <w:t xml:space="preserve">Nov 24</w:t>
+            </w:r>
+          </w:p>
+        </w:tc>
+      </w:tr>
+      <w:tr>
+        <w:trPr>
+          <w:cantSplit w:val="0"/>
+          <w:trHeight w:val="1020" w:hRule="atLeast"/>
+          <w:tblHeader w:val="0"/>
+        </w:trPr>
+        <w:tc>
+          <w:tcPr>
+            <w:tcBorders>
+              <w:top w:color="000000" w:space="0" w:sz="4" w:val="single"/>
+              <w:left w:color="000000" w:space="0" w:sz="4" w:val="single"/>
+              <w:bottom w:color="000000" w:space="0" w:sz="4" w:val="single"/>
+              <w:right w:color="000000" w:space="0" w:sz="4" w:val="single"/>
+            </w:tcBorders>
+            <w:tcMar>
+              <w:top w:w="60.0" w:type="dxa"/>
+              <w:left w:w="60.0" w:type="dxa"/>
+              <w:bottom w:w="60.0" w:type="dxa"/>
+              <w:right w:w="60.0" w:type="dxa"/>
+            </w:tcMar>
+            <w:vAlign w:val="top"/>
+          </w:tcPr>
+          <w:p>
+            <w:pPr>
+              <w:spacing w:after="160" w:lineRule="auto"/>
+              <w:jc w:val="center"/>
+              <w:rPr>
+                <w:color w:val="13284b"/>
+                <w:sz w:val="17"/>
+                <w:szCs w:val="17"/>
+              </w:rPr>
+            </w:pPr>
+            <w:r>
+              <w:rPr>
+                <w:color w:val="13284b"/>
+                <w:sz w:val="17"/>
+                <w:szCs w:val="17"/>
+                <w:rtl w:val="0"/>
+              </w:rPr>
+              <w:t xml:space="preserve">Final Code &amp; Test Completion</w:t>
+            </w:r>
+          </w:p>
+        </w:tc>
+        <w:tc>
+          <w:tcPr>
+            <w:tcBorders>
+              <w:top w:color="000000" w:space="0" w:sz="4" w:val="single"/>
+              <w:left w:color="000000" w:space="0" w:sz="4" w:val="single"/>
+              <w:bottom w:color="000000" w:space="0" w:sz="4" w:val="single"/>
+              <w:right w:color="000000" w:space="0" w:sz="4" w:val="single"/>
+            </w:tcBorders>
+            <w:tcMar>
+              <w:top w:w="60.0" w:type="dxa"/>
+              <w:left w:w="60.0" w:type="dxa"/>
+              <w:bottom w:w="60.0" w:type="dxa"/>
+              <w:right w:w="60.0" w:type="dxa"/>
+            </w:tcMar>
+            <w:vAlign w:val="top"/>
+          </w:tcPr>
+          <w:p>
+            <w:pPr>
+              <w:spacing w:after="160" w:lineRule="auto"/>
+              <w:jc w:val="center"/>
+              <w:rPr>
+                <w:color w:val="13284b"/>
+                <w:sz w:val="17"/>
+                <w:szCs w:val="17"/>
+              </w:rPr>
+            </w:pPr>
+            <w:r>
+              <w:rPr>
+                <w:color w:val="13284b"/>
+                <w:sz w:val="17"/>
+                <w:szCs w:val="17"/>
+                <w:rtl w:val="0"/>
+              </w:rPr>
+              <w:t xml:space="preserve">-</w:t>
+            </w:r>
+          </w:p>
+        </w:tc>
+        <w:tc>
+          <w:tcPr>
+            <w:tcBorders>
+              <w:top w:color="000000" w:space="0" w:sz="4" w:val="single"/>
+              <w:left w:color="000000" w:space="0" w:sz="4" w:val="single"/>
+              <w:bottom w:color="000000" w:space="0" w:sz="4" w:val="single"/>
+              <w:right w:color="000000" w:space="0" w:sz="4" w:val="single"/>
+            </w:tcBorders>
+            <w:tcMar>
+              <w:top w:w="60.0" w:type="dxa"/>
+              <w:left w:w="60.0" w:type="dxa"/>
+              <w:bottom w:w="60.0" w:type="dxa"/>
+              <w:right w:w="60.0" w:type="dxa"/>
+            </w:tcMar>
+            <w:vAlign w:val="top"/>
+          </w:tcPr>
+          <w:p>
+            <w:pPr>
+              <w:spacing w:after="160" w:lineRule="auto"/>
+              <w:jc w:val="center"/>
+              <w:rPr>
+                <w:color w:val="13284b"/>
+                <w:sz w:val="17"/>
+                <w:szCs w:val="17"/>
+              </w:rPr>
+            </w:pPr>
+            <w:r>
+              <w:rPr>
+                <w:color w:val="13284b"/>
+                <w:sz w:val="17"/>
+                <w:szCs w:val="17"/>
+                <w:rtl w:val="0"/>
+              </w:rPr>
+              <w:t xml:space="preserve">Nov 30</w:t>
+            </w:r>
+          </w:p>
+        </w:tc>
+      </w:tr>
+      <w:tr>
+        <w:trPr>
+          <w:cantSplit w:val="0"/>
+          <w:trHeight w:val="1020" w:hRule="atLeast"/>
+          <w:tblHeader w:val="0"/>
+        </w:trPr>
+        <w:tc>
+          <w:tcPr>
+            <w:tcBorders>
+              <w:top w:color="000000" w:space="0" w:sz="4" w:val="single"/>
+              <w:left w:color="000000" w:space="0" w:sz="4" w:val="single"/>
+              <w:bottom w:color="000000" w:space="0" w:sz="4" w:val="single"/>
+              <w:right w:color="000000" w:space="0" w:sz="4" w:val="single"/>
+            </w:tcBorders>
+            <w:tcMar>
+              <w:top w:w="60.0" w:type="dxa"/>
+              <w:left w:w="60.0" w:type="dxa"/>
+              <w:bottom w:w="60.0" w:type="dxa"/>
+              <w:right w:w="60.0" w:type="dxa"/>
+            </w:tcMar>
+            <w:vAlign w:val="top"/>
+          </w:tcPr>
+          <w:p>
+            <w:pPr>
+              <w:spacing w:after="160" w:lineRule="auto"/>
+              <w:jc w:val="center"/>
+              <w:rPr>
+                <w:color w:val="13284b"/>
+                <w:sz w:val="17"/>
+                <w:szCs w:val="17"/>
+              </w:rPr>
+            </w:pPr>
+            <w:r>
+              <w:rPr>
+                <w:color w:val="13284b"/>
+                <w:sz w:val="17"/>
+                <w:szCs w:val="17"/>
+                <w:rtl w:val="0"/>
+              </w:rPr>
+              <w:t xml:space="preserve">Bug &amp; Design Review</w:t>
+            </w:r>
+          </w:p>
+        </w:tc>
+        <w:tc>
+          <w:tcPr>
+            <w:tcBorders>
+              <w:top w:color="000000" w:space="0" w:sz="4" w:val="single"/>
+              <w:left w:color="000000" w:space="0" w:sz="4" w:val="single"/>
+              <w:bottom w:color="000000" w:space="0" w:sz="4" w:val="single"/>
+              <w:right w:color="000000" w:space="0" w:sz="4" w:val="single"/>
+            </w:tcBorders>
+            <w:tcMar>
+              <w:top w:w="60.0" w:type="dxa"/>
+              <w:left w:w="60.0" w:type="dxa"/>
+              <w:bottom w:w="60.0" w:type="dxa"/>
+              <w:right w:w="60.0" w:type="dxa"/>
+            </w:tcMar>
+            <w:vAlign w:val="top"/>
+          </w:tcPr>
+          <w:p>
+            <w:pPr>
+              <w:spacing w:after="160" w:lineRule="auto"/>
+              <w:jc w:val="center"/>
+              <w:rPr>
+                <w:color w:val="13284b"/>
+                <w:sz w:val="17"/>
+                <w:szCs w:val="17"/>
+              </w:rPr>
+            </w:pPr>
+            <w:r>
+              <w:rPr>
+                <w:color w:val="13284b"/>
+                <w:sz w:val="17"/>
+                <w:szCs w:val="17"/>
+                <w:rtl w:val="0"/>
+              </w:rPr>
+              <w:t xml:space="preserve">Dec 2</w:t>
+            </w:r>
+          </w:p>
+        </w:tc>
+        <w:tc>
+          <w:tcPr>
+            <w:tcBorders>
+              <w:top w:color="000000" w:space="0" w:sz="4" w:val="single"/>
+              <w:left w:color="000000" w:space="0" w:sz="4" w:val="single"/>
+              <w:bottom w:color="000000" w:space="0" w:sz="4" w:val="single"/>
+              <w:right w:color="000000" w:space="0" w:sz="4" w:val="single"/>
+            </w:tcBorders>
+            <w:tcMar>
+              <w:top w:w="60.0" w:type="dxa"/>
+              <w:left w:w="60.0" w:type="dxa"/>
+              <w:bottom w:w="60.0" w:type="dxa"/>
+              <w:right w:w="60.0" w:type="dxa"/>
+            </w:tcMar>
+            <w:vAlign w:val="top"/>
+          </w:tcPr>
+          <w:p>
+            <w:pPr>
+              <w:spacing w:after="160" w:lineRule="auto"/>
+              <w:jc w:val="center"/>
+              <w:rPr>
+                <w:color w:val="13284b"/>
+                <w:sz w:val="17"/>
+                <w:szCs w:val="17"/>
+              </w:rPr>
+            </w:pPr>
+            <w:r>
+              <w:rPr>
+                <w:color w:val="13284b"/>
+                <w:sz w:val="17"/>
+                <w:szCs w:val="17"/>
+                <w:rtl w:val="0"/>
+              </w:rPr>
+              <w:t xml:space="preserve">Dec 6</w:t>
+            </w:r>
+          </w:p>
+        </w:tc>
+      </w:tr>
+    </w:tbl>
+    <w:p>
+      <w:pPr>
+        <w:rPr>
+          <w:color w:val="13284b"/>
           <w:sz w:val="17"/>
           <w:szCs w:val="17"/>
         </w:rPr>
       </w:pPr>
       <w:r>
         <w:rPr>
+          <w:rtl w:val="0"/>
+        </w:rPr>
+      </w:r>
+    </w:p>
+    <w:p>
+      <w:pPr>
+        <w:rPr>
           <w:b w:val="1"/>
           <w:color w:val="3f6caf"/>
           <w:sz w:val="17"/>
           <w:szCs w:val="17"/>
+        </w:rPr>
+      </w:pPr>
+      <w:r>
+        <w:rPr>
+          <w:rtl w:val="0"/>
+        </w:rPr>
+      </w:r>
+    </w:p>
+    <w:p>
+      <w:pPr>
+        <w:rPr>
+          <w:b w:val="1"/>
+          <w:color w:val="3f6caf"/>
+          <w:sz w:val="18"/>
+          <w:szCs w:val="18"/>
+        </w:rPr>
+      </w:pPr>
+      <w:r>
+        <w:rPr>
+          <w:b w:val="1"/>
+          <w:color w:val="3f6caf"/>
+          <w:sz w:val="18"/>
+          <w:szCs w:val="18"/>
           <w:rtl w:val="0"/>
         </w:rPr>
         <w:t xml:space="preserve">1.2 Timing Issues</w:t>
@@ -108,8 +893,9 @@
     </w:p>
     <w:p>
       <w:pPr>
-        <w:spacing w:after="160" w:lineRule="auto"/>
-        <w:rPr>
+        <w:rPr>
+          <w:b w:val="1"/>
+          <w:color w:val="3f6caf"/>
           <w:sz w:val="17"/>
           <w:szCs w:val="17"/>
         </w:rPr>
@@ -122,23 +908,225 @@
     </w:p>
     <w:p>
       <w:pPr>
+        <w:numPr>
+          <w:ilvl w:val="0"/>
+          <w:numId w:val="1"/>
+        </w:numPr>
+        <w:spacing w:after="0" w:afterAutospacing="0" w:line="360" w:lineRule="auto"/>
+        <w:ind w:left="720" w:hanging="360"/>
+        <w:rPr>
+          <w:sz w:val="18"/>
+          <w:szCs w:val="18"/>
+        </w:rPr>
+      </w:pPr>
+      <w:r>
+        <w:rPr>
+          <w:sz w:val="18"/>
+          <w:szCs w:val="18"/>
+          <w:rtl w:val="0"/>
+        </w:rPr>
+        <w:t xml:space="preserve">Missed Milestones (Feedback):</w:t>
+      </w:r>
+    </w:p>
+    <w:p>
+      <w:pPr>
+        <w:numPr>
+          <w:ilvl w:val="1"/>
+          <w:numId w:val="1"/>
+        </w:numPr>
+        <w:spacing w:after="0" w:afterAutospacing="0" w:line="360" w:lineRule="auto"/>
+        <w:ind w:left="1440" w:hanging="360"/>
+        <w:rPr>
+          <w:sz w:val="18"/>
+          <w:szCs w:val="18"/>
+        </w:rPr>
+      </w:pPr>
+      <w:r>
+        <w:rPr>
+          <w:sz w:val="18"/>
+          <w:szCs w:val="18"/>
+          <w:rtl w:val="0"/>
+        </w:rPr>
+        <w:t xml:space="preserve">The team did not allocate time to gather and consider feedback from other groups, missing a key opportunity to refine the project’s direction.</w:t>
+      </w:r>
+    </w:p>
+    <w:p>
+      <w:pPr>
+        <w:numPr>
+          <w:ilvl w:val="0"/>
+          <w:numId w:val="1"/>
+        </w:numPr>
+        <w:spacing w:after="0" w:afterAutospacing="0" w:line="360" w:lineRule="auto"/>
+        <w:ind w:left="720" w:hanging="360"/>
+        <w:rPr>
+          <w:sz w:val="18"/>
+          <w:szCs w:val="18"/>
+        </w:rPr>
+      </w:pPr>
+      <w:r>
+        <w:rPr>
+          <w:sz w:val="18"/>
+          <w:szCs w:val="18"/>
+          <w:rtl w:val="0"/>
+        </w:rPr>
+        <w:t xml:space="preserve">Missed Milestones (Code Integration):</w:t>
+      </w:r>
+    </w:p>
+    <w:p>
+      <w:pPr>
+        <w:numPr>
+          <w:ilvl w:val="1"/>
+          <w:numId w:val="1"/>
+        </w:numPr>
+        <w:spacing w:after="0" w:afterAutospacing="0" w:line="360" w:lineRule="auto"/>
+        <w:ind w:left="1440" w:hanging="360"/>
+        <w:rPr>
+          <w:sz w:val="18"/>
+          <w:szCs w:val="18"/>
+        </w:rPr>
+      </w:pPr>
+      <w:r>
+        <w:rPr>
+          <w:sz w:val="18"/>
+          <w:szCs w:val="18"/>
+          <w:rtl w:val="0"/>
+        </w:rPr>
+        <w:t xml:space="preserve">There is no indication of planned code integration or communication between the front-end and back-end development teams, which is essential for aligning the project components.</w:t>
+      </w:r>
+    </w:p>
+    <w:p>
+      <w:pPr>
+        <w:numPr>
+          <w:ilvl w:val="0"/>
+          <w:numId w:val="1"/>
+        </w:numPr>
+        <w:spacing w:after="0" w:afterAutospacing="0" w:line="360" w:lineRule="auto"/>
+        <w:ind w:left="720" w:hanging="360"/>
+        <w:rPr>
+          <w:sz w:val="18"/>
+          <w:szCs w:val="18"/>
+        </w:rPr>
+      </w:pPr>
+      <w:r>
+        <w:rPr>
+          <w:sz w:val="18"/>
+          <w:szCs w:val="18"/>
+          <w:rtl w:val="0"/>
+        </w:rPr>
+        <w:t xml:space="preserve">Unrealistic Deadlines:</w:t>
+      </w:r>
+    </w:p>
+    <w:p>
+      <w:pPr>
+        <w:numPr>
+          <w:ilvl w:val="1"/>
+          <w:numId w:val="1"/>
+        </w:numPr>
+        <w:spacing w:after="0" w:afterAutospacing="0" w:line="360" w:lineRule="auto"/>
+        <w:ind w:left="1440" w:hanging="360"/>
+        <w:rPr>
+          <w:sz w:val="18"/>
+          <w:szCs w:val="18"/>
+        </w:rPr>
+      </w:pPr>
+      <w:r>
+        <w:rPr>
+          <w:sz w:val="18"/>
+          <w:szCs w:val="18"/>
+          <w:rtl w:val="0"/>
+        </w:rPr>
+        <w:t xml:space="preserve">Bug testing and design review are scheduled too close to the final deadline, leaving insufficient time for proper issue resolution.</w:t>
+      </w:r>
+    </w:p>
+    <w:p>
+      <w:pPr>
+        <w:numPr>
+          <w:ilvl w:val="0"/>
+          <w:numId w:val="1"/>
+        </w:numPr>
+        <w:spacing w:after="0" w:afterAutospacing="0" w:line="360" w:lineRule="auto"/>
+        <w:ind w:left="720" w:hanging="360"/>
+        <w:rPr>
+          <w:sz w:val="18"/>
+          <w:szCs w:val="18"/>
+        </w:rPr>
+      </w:pPr>
+      <w:r>
+        <w:rPr>
+          <w:sz w:val="18"/>
+          <w:szCs w:val="18"/>
+          <w:rtl w:val="0"/>
+        </w:rPr>
+        <w:t xml:space="preserve">Task Dependencies:</w:t>
+      </w:r>
+    </w:p>
+    <w:p>
+      <w:pPr>
+        <w:numPr>
+          <w:ilvl w:val="1"/>
+          <w:numId w:val="1"/>
+        </w:numPr>
+        <w:spacing w:after="160" w:line="360" w:lineRule="auto"/>
+        <w:ind w:left="1440" w:hanging="360"/>
+        <w:rPr>
+          <w:sz w:val="18"/>
+          <w:szCs w:val="18"/>
+        </w:rPr>
+      </w:pPr>
+      <w:r>
+        <w:rPr>
+          <w:sz w:val="18"/>
+          <w:szCs w:val="18"/>
+          <w:rtl w:val="0"/>
+        </w:rPr>
+        <w:t xml:space="preserve">The front-end team requires input from the authentication team to complete the login/registration page by November 20. Any delay in this data handoff could hinder the front-end team’s progress and push back the timeline.</w:t>
+      </w:r>
+    </w:p>
+    <w:p>
+      <w:pPr>
+        <w:spacing w:after="160" w:line="360" w:lineRule="auto"/>
+        <w:ind w:left="0" w:firstLine="0"/>
+        <w:rPr>
+          <w:b w:val="1"/>
+          <w:color w:val="3f6caf"/>
+          <w:sz w:val="24"/>
+          <w:szCs w:val="24"/>
+        </w:rPr>
+      </w:pPr>
+      <w:r>
+        <w:rPr>
+          <w:b w:val="1"/>
+          <w:color w:val="3f6caf"/>
+          <w:sz w:val="24"/>
+          <w:szCs w:val="24"/>
+          <w:rtl w:val="0"/>
+        </w:rPr>
+        <w:t xml:space="preserve">2. Highlighting Potential Risks</w:t>
+      </w:r>
+    </w:p>
+    <w:p>
+      <w:pPr>
         <w:spacing w:after="160" w:lineRule="auto"/>
         <w:rPr>
-          <w:b w:val="1"/>
-          <w:color w:val="3f6caf"/>
-          <w:sz w:val="20"/>
-          <w:szCs w:val="20"/>
-        </w:rPr>
-      </w:pPr>
-      <w:r>
-        <w:rPr>
-          <w:b w:val="1"/>
-          <w:color w:val="3f6caf"/>
-          <w:sz w:val="20"/>
-          <w:szCs w:val="20"/>
-          <w:rtl w:val="0"/>
-        </w:rPr>
-        <w:t xml:space="preserve">2. Highlighting Potential Risks</w:t>
+          <w:color w:val="13284b"/>
+          <w:sz w:val="18"/>
+          <w:szCs w:val="18"/>
+        </w:rPr>
+      </w:pPr>
+      <w:r>
+        <w:rPr>
+          <w:b w:val="1"/>
+          <w:color w:val="3f6caf"/>
+          <w:sz w:val="18"/>
+          <w:szCs w:val="18"/>
+          <w:rtl w:val="0"/>
+        </w:rPr>
+        <w:t xml:space="preserve">2.1 Key Risks Impacting Completion</w:t>
+      </w:r>
+      <w:r>
+        <w:rPr>
+          <w:rtl w:val="0"/>
+        </w:rPr>
       </w:r>
     </w:p>
     <w:p>
@@ -147,19 +1135,33 @@
         <w:rPr>
           <w:b w:val="1"/>
           <w:color w:val="3f6caf"/>
+          <w:sz w:val="18"/>
+          <w:szCs w:val="18"/>
+        </w:rPr>
+      </w:pPr>
+      <w:r>
+        <w:rPr>
+          <w:b w:val="1"/>
+          <w:color w:val="3f6caf"/>
+          <w:sz w:val="18"/>
+          <w:szCs w:val="18"/>
+          <w:rtl w:val="0"/>
+        </w:rPr>
+        <w:t xml:space="preserve">2.2 Additional Risks and Considerations</w:t>
+      </w:r>
+    </w:p>
+    <w:p>
+      <w:pPr>
+        <w:spacing w:after="160" w:lineRule="auto"/>
+        <w:rPr>
           <w:sz w:val="17"/>
           <w:szCs w:val="17"/>
         </w:rPr>
       </w:pPr>
       <w:r>
         <w:rPr>
-          <w:b w:val="1"/>
-          <w:color w:val="3f6caf"/>
-          <w:sz w:val="17"/>
-          <w:szCs w:val="17"/>
-          <w:rtl w:val="0"/>
-        </w:rPr>
-        <w:t xml:space="preserve">2.1 Key Risks Impacting Completion</w:t>
+          <w:rtl w:val="0"/>
+        </w:rPr>
       </w:r>
     </w:p>
     <w:p>
@@ -168,72 +1170,37 @@
         <w:rPr>
           <w:b w:val="1"/>
           <w:color w:val="3f6caf"/>
-          <w:sz w:val="17"/>
-          <w:szCs w:val="17"/>
-        </w:rPr>
-      </w:pPr>
-      <w:r>
-        <w:rPr>
-          <w:b w:val="1"/>
-          <w:color w:val="3f6caf"/>
-          <w:sz w:val="17"/>
-          <w:szCs w:val="17"/>
-          <w:rtl w:val="0"/>
-        </w:rPr>
-        <w:t xml:space="preserve">2.2 Additional Risks and Considerations</w:t>
+          <w:sz w:val="24"/>
+          <w:szCs w:val="24"/>
+        </w:rPr>
+      </w:pPr>
+      <w:r>
+        <w:rPr>
+          <w:b w:val="1"/>
+          <w:color w:val="3f6caf"/>
+          <w:sz w:val="24"/>
+          <w:szCs w:val="24"/>
+          <w:rtl w:val="0"/>
+        </w:rPr>
+        <w:t xml:space="preserve">3. Suggestions for Improvement</w:t>
       </w:r>
     </w:p>
     <w:p>
       <w:pPr>
         <w:spacing w:after="160" w:lineRule="auto"/>
         <w:rPr>
-          <w:sz w:val="17"/>
-          <w:szCs w:val="17"/>
-        </w:rPr>
-      </w:pPr>
-      <w:r>
-        <w:rPr>
-          <w:rtl w:val="0"/>
-        </w:rPr>
-      </w:r>
-    </w:p>
-    <w:p>
-      <w:pPr>
-        <w:spacing w:after="160" w:lineRule="auto"/>
-        <w:rPr>
-          <w:b w:val="1"/>
-          <w:color w:val="3f6caf"/>
-          <w:sz w:val="20"/>
-          <w:szCs w:val="20"/>
-        </w:rPr>
-      </w:pPr>
-      <w:r>
-        <w:rPr>
-          <w:b w:val="1"/>
-          <w:color w:val="3f6caf"/>
-          <w:sz w:val="20"/>
-          <w:szCs w:val="20"/>
-          <w:rtl w:val="0"/>
-        </w:rPr>
-        <w:t xml:space="preserve">3. Suggestions for Improvement</w:t>
-      </w:r>
-    </w:p>
-    <w:p>
-      <w:pPr>
-        <w:spacing w:after="160" w:lineRule="auto"/>
-        <w:rPr>
-          <w:b w:val="1"/>
-          <w:color w:val="3f6caf"/>
-          <w:sz w:val="17"/>
-          <w:szCs w:val="17"/>
-        </w:rPr>
-      </w:pPr>
-      <w:r>
-        <w:rPr>
-          <w:b w:val="1"/>
-          <w:color w:val="3f6caf"/>
-          <w:sz w:val="17"/>
-          <w:szCs w:val="17"/>
+          <w:b w:val="1"/>
+          <w:color w:val="3f6caf"/>
+          <w:sz w:val="18"/>
+          <w:szCs w:val="18"/>
+        </w:rPr>
+      </w:pPr>
+      <w:r>
+        <w:rPr>
+          <w:b w:val="1"/>
+          <w:color w:val="3f6caf"/>
+          <w:sz w:val="18"/>
+          <w:szCs w:val="18"/>
           <w:rtl w:val="0"/>
         </w:rPr>
         <w:t xml:space="preserve">3.1 Timeline and Task Reordering</w:t>
@@ -244,54 +1211,19 @@
         <w:rPr>
           <w:b w:val="1"/>
           <w:color w:val="3f6caf"/>
-          <w:sz w:val="17"/>
-          <w:szCs w:val="17"/>
-        </w:rPr>
-      </w:pPr>
-      <w:r>
-        <w:rPr>
-          <w:b w:val="1"/>
-          <w:color w:val="3f6caf"/>
-          <w:sz w:val="17"/>
-          <w:szCs w:val="17"/>
-          <w:rtl w:val="0"/>
-        </w:rPr>
-        <w:t xml:space="preserve">3.2 Process Improvements</w:t>
-      </w:r>
-    </w:p>
-    <w:p>
-      <w:pPr>
-        <w:rPr>
-          <w:b w:val="1"/>
-          <w:color w:val="3f6caf"/>
-          <w:sz w:val="17"/>
-          <w:szCs w:val="17"/>
-        </w:rPr>
-      </w:pPr>
-      <w:r>
-        <w:rPr>
-          <w:rtl w:val="0"/>
-        </w:rPr>
-      </w:r>
-    </w:p>
-    <w:p>
-      <w:pPr>
-        <w:rPr>
-          <w:b w:val="1"/>
-          <w:color w:val="3f6caf"/>
-          <w:sz w:val="17"/>
-          <w:szCs w:val="17"/>
-        </w:rPr>
-      </w:pPr>
-      <w:r>
-        <w:rPr>
-          <w:b w:val="1"/>
-          <w:color w:val="3f6caf"/>
-          <w:sz w:val="17"/>
-          <w:szCs w:val="17"/>
-          <w:rtl w:val="0"/>
-        </w:rPr>
-        <w:t xml:space="preserve">3.3 Resource and Allocation Suggestions</w:t>
+          <w:sz w:val="18"/>
+          <w:szCs w:val="18"/>
+        </w:rPr>
+      </w:pPr>
+      <w:r>
+        <w:rPr>
+          <w:b w:val="1"/>
+          <w:color w:val="3f6caf"/>
+          <w:sz w:val="18"/>
+          <w:szCs w:val="18"/>
+          <w:rtl w:val="0"/>
+        </w:rPr>
+        <w:t xml:space="preserve">3.2 Resource and Allocation Suggestions</w:t>
       </w:r>
     </w:p>
     <w:p>
@@ -372,7 +1304,121 @@
 </file>
 
 <file path=word/numbering.xml><?xml version="1.0" encoding="utf-8"?>
-<w:numbering xmlns:mc="http://schemas.openxmlformats.org/markup-compatibility/2006" xmlns:o="urn:schemas-microsoft-com:office:office" xmlns:r="http://schemas.openxmlformats.org/officeDocument/2006/relationships" xmlns:m="http://schemas.openxmlformats.org/officeDocument/2006/math" xmlns:v="urn:schemas-microsoft-com:vml" xmlns:wp="http://schemas.openxmlformats.org/drawingml/2006/wordprocessingDrawing" xmlns:w10="urn:schemas-microsoft-com:office:word" xmlns:w="http://schemas.openxmlformats.org/wordprocessingml/2006/main" xmlns:wne="http://schemas.microsoft.com/office/word/2006/wordml" xmlns:sl="http://schemas.openxmlformats.org/schemaLibrary/2006/main" xmlns:a="http://schemas.openxmlformats.org/drawingml/2006/main" xmlns:pic="http://schemas.openxmlformats.org/drawingml/2006/picture" xmlns:c="http://schemas.openxmlformats.org/drawingml/2006/chart" xmlns:lc="http://schemas.openxmlformats.org/drawingml/2006/lockedCanvas" xmlns:dgm="http://schemas.openxmlformats.org/drawingml/2006/diagram" xmlns:wps="http://schemas.microsoft.com/office/word/2010/wordprocessingShape" xmlns:wpg="http://schemas.microsoft.com/office/word/2010/wordprocessingGroup" xmlns:w14="http://schemas.microsoft.com/office/word/2010/wordml" xmlns:w15="http://schemas.microsoft.com/office/word/2012/wordml" xmlns:w16="http://schemas.microsoft.com/office/word/2018/wordml" xmlns:w16cex="http://schemas.microsoft.com/office/word/2018/wordml/cex" xmlns:w16cid="http://schemas.microsoft.com/office/word/2016/wordml/cid" xmlns="http://schemas.microsoft.com/office/tasks/2019/documenttasks" xmlns:cr="http://schemas.microsoft.com/office/comments/2020/reactions"/>
+<w:numbering xmlns:mc="http://schemas.openxmlformats.org/markup-compatibility/2006" xmlns:o="urn:schemas-microsoft-com:office:office" xmlns:r="http://schemas.openxmlformats.org/officeDocument/2006/relationships" xmlns:m="http://schemas.openxmlformats.org/officeDocument/2006/math" xmlns:v="urn:schemas-microsoft-com:vml" xmlns:wp="http://schemas.openxmlformats.org/drawingml/2006/wordprocessingDrawing" xmlns:w10="urn:schemas-microsoft-com:office:word" xmlns:w="http://schemas.openxmlformats.org/wordprocessingml/2006/main" xmlns:wne="http://schemas.microsoft.com/office/word/2006/wordml" xmlns:sl="http://schemas.openxmlformats.org/schemaLibrary/2006/main" xmlns:a="http://schemas.openxmlformats.org/drawingml/2006/main" xmlns:pic="http://schemas.openxmlformats.org/drawingml/2006/picture" xmlns:c="http://schemas.openxmlformats.org/drawingml/2006/chart" xmlns:lc="http://schemas.openxmlformats.org/drawingml/2006/lockedCanvas" xmlns:dgm="http://schemas.openxmlformats.org/drawingml/2006/diagram" xmlns:wps="http://schemas.microsoft.com/office/word/2010/wordprocessingShape" xmlns:wpg="http://schemas.microsoft.com/office/word/2010/wordprocessingGroup" xmlns:w14="http://schemas.microsoft.com/office/word/2010/wordml" xmlns:w15="http://schemas.microsoft.com/office/word/2012/wordml" xmlns:w16="http://schemas.microsoft.com/office/word/2018/wordml" xmlns:w16cex="http://schemas.microsoft.com/office/word/2018/wordml/cex" xmlns:w16cid="http://schemas.microsoft.com/office/word/2016/wordml/cid" xmlns="http://schemas.microsoft.com/office/tasks/2019/documenttasks" xmlns:cr="http://schemas.microsoft.com/office/comments/2020/reactions">
+  <w:abstractNum w:abstractNumId="1">
+    <w:lvl w:ilvl="0">
+      <w:start w:val="1"/>
+      <w:numFmt w:val="bullet"/>
+      <w:lvlText w:val="●"/>
+      <w:lvlJc w:val="left"/>
+      <w:pPr>
+        <w:ind w:left="720" w:hanging="360"/>
+      </w:pPr>
+      <w:rPr>
+        <w:u w:val="none"/>
+      </w:rPr>
+    </w:lvl>
+    <w:lvl w:ilvl="1">
+      <w:start w:val="1"/>
+      <w:numFmt w:val="bullet"/>
+      <w:lvlText w:val="○"/>
+      <w:lvlJc w:val="left"/>
+      <w:pPr>
+        <w:ind w:left="1440" w:hanging="360"/>
+      </w:pPr>
+      <w:rPr>
+        <w:u w:val="none"/>
+      </w:rPr>
+    </w:lvl>
+    <w:lvl w:ilvl="2">
+      <w:start w:val="1"/>
+      <w:numFmt w:val="bullet"/>
+      <w:lvlText w:val="■"/>
+      <w:lvlJc w:val="left"/>
+      <w:pPr>
+        <w:ind w:left="2160" w:hanging="360"/>
+      </w:pPr>
+      <w:rPr>
+        <w:u w:val="none"/>
+      </w:rPr>
+    </w:lvl>
+    <w:lvl w:ilvl="3">
+      <w:start w:val="1"/>
+      <w:numFmt w:val="bullet"/>
+      <w:lvlText w:val="●"/>
+      <w:lvlJc w:val="left"/>
+      <w:pPr>
+        <w:ind w:left="2880" w:hanging="360"/>
+      </w:pPr>
+      <w:rPr>
+        <w:u w:val="none"/>
+      </w:rPr>
+    </w:lvl>
+    <w:lvl w:ilvl="4">
+      <w:start w:val="1"/>
+      <w:numFmt w:val="bullet"/>
+      <w:lvlText w:val="○"/>
+      <w:lvlJc w:val="left"/>
+      <w:pPr>
+        <w:ind w:left="3600" w:hanging="360"/>
+      </w:pPr>
+      <w:rPr>
+        <w:u w:val="none"/>
+      </w:rPr>
+    </w:lvl>
+    <w:lvl w:ilvl="5">
+      <w:start w:val="1"/>
+      <w:numFmt w:val="bullet"/>
+      <w:lvlText w:val="■"/>
+      <w:lvlJc w:val="left"/>
+      <w:pPr>
+        <w:ind w:left="4320" w:hanging="360"/>
+      </w:pPr>
+      <w:rPr>
+        <w:u w:val="none"/>
+      </w:rPr>
+    </w:lvl>
+    <w:lvl w:ilvl="6">
+      <w:start w:val="1"/>
+      <w:numFmt w:val="bullet"/>
+      <w:lvlText w:val="●"/>
+      <w:lvlJc w:val="left"/>
+      <w:pPr>
+        <w:ind w:left="5040" w:hanging="360"/>
+      </w:pPr>
+      <w:rPr>
+        <w:u w:val="none"/>
+      </w:rPr>
+    </w:lvl>
+    <w:lvl w:ilvl="7">
+      <w:start w:val="1"/>
+      <w:numFmt w:val="bullet"/>
+      <w:lvlText w:val="○"/>
+      <w:lvlJc w:val="left"/>
+      <w:pPr>
+        <w:ind w:left="5760" w:hanging="360"/>
+      </w:pPr>
+      <w:rPr>
+        <w:u w:val="none"/>
+      </w:rPr>
+    </w:lvl>
+    <w:lvl w:ilvl="8">
+      <w:start w:val="1"/>
+      <w:numFmt w:val="bullet"/>
+      <w:lvlText w:val="■"/>
+      <w:lvlJc w:val="left"/>
+      <w:pPr>
+        <w:ind w:left="6480" w:hanging="360"/>
+      </w:pPr>
+      <w:rPr>
+        <w:u w:val="none"/>
+      </w:rPr>
+    </w:lvl>
+  </w:abstractNum>
+  <w:num w:numId="1">
+    <w:abstractNumId w:val="1"/>
+  </w:num>
+</w:numbering>
 </file>
 
 <file path=word/styles.xml><?xml version="1.0" encoding="utf-8"?>
@@ -527,6 +1573,55 @@
       <w:sz w:val="30"/>
       <w:szCs w:val="30"/>
     </w:rPr>
+  </w:style>
+  <w:style w:type="table" w:styleId="Table1">
+    <w:basedOn w:val="TableNormal"/>
+    <w:tblPr>
+      <w:tblStyleRowBandSize w:val="1"/>
+      <w:tblStyleColBandSize w:val="1"/>
+      <w:tblCellMar>
+        <w:top w:w="100.0" w:type="dxa"/>
+        <w:left w:w="100.0" w:type="dxa"/>
+        <w:bottom w:w="100.0" w:type="dxa"/>
+        <w:right w:w="100.0" w:type="dxa"/>
+      </w:tblCellMar>
+    </w:tblPr>
+    <w:tblStylePr w:type="band1Horz">
+      <w:tcPr/>
+    </w:tblStylePr>
+    <w:tblStylePr w:type="band1Vert">
+      <w:tcPr/>
+    </w:tblStylePr>
+    <w:tblStylePr w:type="band2Horz">
+      <w:tcPr/>
+    </w:tblStylePr>
+    <w:tblStylePr w:type="band2Vert">
+      <w:tcPr/>
+    </w:tblStylePr>
+    <w:tblStylePr w:type="firstCol">
+      <w:tcPr/>
+    </w:tblStylePr>
+    <w:tblStylePr w:type="firstRow">
+      <w:tcPr/>
+    </w:tblStylePr>
+    <w:tblStylePr w:type="lastCol">
+      <w:tcPr/>
+    </w:tblStylePr>
+    <w:tblStylePr w:type="lastRow">
+      <w:tcPr/>
+    </w:tblStylePr>
+    <w:tblStylePr w:type="neCell">
+      <w:tcPr/>
+    </w:tblStylePr>
+    <w:tblStylePr w:type="nwCell">
+      <w:tcPr/>
+    </w:tblStylePr>
+    <w:tblStylePr w:type="seCell">
+      <w:tcPr/>
+    </w:tblStylePr>
+    <w:tblStylePr w:type="swCell">
+      <w:tcPr/>
+    </w:tblStylePr>
   </w:style>
 </w:styles>
 </file>

</xml_diff>

<commit_message>
Highlighted risks that could impact completion and overall project quality.
</commit_message>
<xml_diff>
--- a/Iteration_2/Echo_Review/final_submission/Planning_Review_Authentication_Team.docx
+++ b/Iteration_2/Echo_Review/final_submission/Planning_Review_Authentication_Team.docx
@@ -910,7 +910,7 @@
       <w:pPr>
         <w:numPr>
           <w:ilvl w:val="0"/>
-          <w:numId w:val="1"/>
+          <w:numId w:val="2"/>
         </w:numPr>
         <w:spacing w:after="0" w:afterAutospacing="0" w:line="360" w:lineRule="auto"/>
         <w:ind w:left="720" w:hanging="360"/>
@@ -932,7 +932,7 @@
       <w:pPr>
         <w:numPr>
           <w:ilvl w:val="1"/>
-          <w:numId w:val="1"/>
+          <w:numId w:val="2"/>
         </w:numPr>
         <w:spacing w:after="0" w:afterAutospacing="0" w:line="360" w:lineRule="auto"/>
         <w:ind w:left="1440" w:hanging="360"/>
@@ -948,6 +948,181 @@
           <w:rtl w:val="0"/>
         </w:rPr>
         <w:t xml:space="preserve">The team did not allocate time to gather and consider feedback from other groups, missing a key opportunity to refine the project’s direction.</w:t>
+      </w:r>
+    </w:p>
+    <w:p>
+      <w:pPr>
+        <w:numPr>
+          <w:ilvl w:val="0"/>
+          <w:numId w:val="2"/>
+        </w:numPr>
+        <w:spacing w:after="0" w:afterAutospacing="0" w:line="360" w:lineRule="auto"/>
+        <w:ind w:left="720" w:hanging="360"/>
+        <w:rPr>
+          <w:sz w:val="18"/>
+          <w:szCs w:val="18"/>
+        </w:rPr>
+      </w:pPr>
+      <w:r>
+        <w:rPr>
+          <w:sz w:val="18"/>
+          <w:szCs w:val="18"/>
+          <w:rtl w:val="0"/>
+        </w:rPr>
+        <w:t xml:space="preserve">Missed Milestones (Code Integration):</w:t>
+      </w:r>
+    </w:p>
+    <w:p>
+      <w:pPr>
+        <w:numPr>
+          <w:ilvl w:val="1"/>
+          <w:numId w:val="2"/>
+        </w:numPr>
+        <w:spacing w:after="0" w:afterAutospacing="0" w:line="360" w:lineRule="auto"/>
+        <w:ind w:left="1440" w:hanging="360"/>
+        <w:rPr>
+          <w:sz w:val="18"/>
+          <w:szCs w:val="18"/>
+        </w:rPr>
+      </w:pPr>
+      <w:r>
+        <w:rPr>
+          <w:sz w:val="18"/>
+          <w:szCs w:val="18"/>
+          <w:rtl w:val="0"/>
+        </w:rPr>
+        <w:t xml:space="preserve">There is no indication of planned code integration or communication between the front-end and back-end development teams, which is essential for aligning the project components.</w:t>
+      </w:r>
+    </w:p>
+    <w:p>
+      <w:pPr>
+        <w:numPr>
+          <w:ilvl w:val="0"/>
+          <w:numId w:val="2"/>
+        </w:numPr>
+        <w:spacing w:after="0" w:afterAutospacing="0" w:line="360" w:lineRule="auto"/>
+        <w:ind w:left="720" w:hanging="360"/>
+        <w:rPr>
+          <w:sz w:val="18"/>
+          <w:szCs w:val="18"/>
+        </w:rPr>
+      </w:pPr>
+      <w:r>
+        <w:rPr>
+          <w:sz w:val="18"/>
+          <w:szCs w:val="18"/>
+          <w:rtl w:val="0"/>
+        </w:rPr>
+        <w:t xml:space="preserve">Unrealistic Deadlines:</w:t>
+      </w:r>
+    </w:p>
+    <w:p>
+      <w:pPr>
+        <w:numPr>
+          <w:ilvl w:val="1"/>
+          <w:numId w:val="2"/>
+        </w:numPr>
+        <w:spacing w:after="0" w:afterAutospacing="0" w:line="360" w:lineRule="auto"/>
+        <w:ind w:left="1440" w:hanging="360"/>
+        <w:rPr>
+          <w:sz w:val="18"/>
+          <w:szCs w:val="18"/>
+        </w:rPr>
+      </w:pPr>
+      <w:r>
+        <w:rPr>
+          <w:sz w:val="18"/>
+          <w:szCs w:val="18"/>
+          <w:rtl w:val="0"/>
+        </w:rPr>
+        <w:t xml:space="preserve">Bug testing and design review are scheduled too close to the final deadline, leaving insufficient time for proper issue resolution.</w:t>
+      </w:r>
+    </w:p>
+    <w:p>
+      <w:pPr>
+        <w:numPr>
+          <w:ilvl w:val="0"/>
+          <w:numId w:val="2"/>
+        </w:numPr>
+        <w:spacing w:after="0" w:afterAutospacing="0" w:line="360" w:lineRule="auto"/>
+        <w:ind w:left="720" w:hanging="360"/>
+        <w:rPr>
+          <w:sz w:val="18"/>
+          <w:szCs w:val="18"/>
+        </w:rPr>
+      </w:pPr>
+      <w:r>
+        <w:rPr>
+          <w:sz w:val="18"/>
+          <w:szCs w:val="18"/>
+          <w:rtl w:val="0"/>
+        </w:rPr>
+        <w:t xml:space="preserve">Task Dependencies:</w:t>
+      </w:r>
+    </w:p>
+    <w:p>
+      <w:pPr>
+        <w:numPr>
+          <w:ilvl w:val="1"/>
+          <w:numId w:val="2"/>
+        </w:numPr>
+        <w:spacing w:after="160" w:line="360" w:lineRule="auto"/>
+        <w:ind w:left="1440" w:hanging="360"/>
+        <w:rPr>
+          <w:sz w:val="18"/>
+          <w:szCs w:val="18"/>
+        </w:rPr>
+      </w:pPr>
+      <w:r>
+        <w:rPr>
+          <w:sz w:val="18"/>
+          <w:szCs w:val="18"/>
+          <w:rtl w:val="0"/>
+        </w:rPr>
+        <w:t xml:space="preserve">The front-end team requires input from the authentication team to complete the login/registration page by November 20. Any delay in this data handoff could hinder the front-end team’s progress and push back the timeline.</w:t>
+      </w:r>
+    </w:p>
+    <w:p>
+      <w:pPr>
+        <w:spacing w:after="160" w:line="360" w:lineRule="auto"/>
+        <w:ind w:left="0" w:firstLine="0"/>
+        <w:rPr>
+          <w:b w:val="1"/>
+          <w:color w:val="3f6caf"/>
+          <w:sz w:val="24"/>
+          <w:szCs w:val="24"/>
+        </w:rPr>
+      </w:pPr>
+      <w:r>
+        <w:rPr>
+          <w:b w:val="1"/>
+          <w:color w:val="3f6caf"/>
+          <w:sz w:val="24"/>
+          <w:szCs w:val="24"/>
+          <w:rtl w:val="0"/>
+        </w:rPr>
+        <w:t xml:space="preserve">2. Highlighting Potential Risks</w:t>
+      </w:r>
+    </w:p>
+    <w:p>
+      <w:pPr>
+        <w:spacing w:after="160" w:lineRule="auto"/>
+        <w:rPr>
+          <w:b w:val="1"/>
+          <w:color w:val="3f6caf"/>
+          <w:sz w:val="18"/>
+          <w:szCs w:val="18"/>
+        </w:rPr>
+      </w:pPr>
+      <w:r>
+        <w:rPr>
+          <w:b w:val="1"/>
+          <w:color w:val="3f6caf"/>
+          <w:sz w:val="18"/>
+          <w:szCs w:val="18"/>
+          <w:rtl w:val="0"/>
+        </w:rPr>
+        <w:t xml:space="preserve">2.1 Key Risks Impacting Completion</w:t>
       </w:r>
     </w:p>
     <w:p>
@@ -961,37 +1136,16 @@
         <w:rPr>
           <w:sz w:val="18"/>
           <w:szCs w:val="18"/>
-        </w:rPr>
-      </w:pPr>
-      <w:r>
-        <w:rPr>
-          <w:sz w:val="18"/>
-          <w:szCs w:val="18"/>
-          <w:rtl w:val="0"/>
-        </w:rPr>
-        <w:t xml:space="preserve">Missed Milestones (Code Integration):</w:t>
-      </w:r>
-    </w:p>
-    <w:p>
-      <w:pPr>
-        <w:numPr>
-          <w:ilvl w:val="1"/>
-          <w:numId w:val="1"/>
-        </w:numPr>
-        <w:spacing w:after="0" w:afterAutospacing="0" w:line="360" w:lineRule="auto"/>
-        <w:ind w:left="1440" w:hanging="360"/>
-        <w:rPr>
-          <w:sz w:val="18"/>
-          <w:szCs w:val="18"/>
-        </w:rPr>
-      </w:pPr>
-      <w:r>
-        <w:rPr>
-          <w:sz w:val="18"/>
-          <w:szCs w:val="18"/>
-          <w:rtl w:val="0"/>
-        </w:rPr>
-        <w:t xml:space="preserve">There is no indication of planned code integration or communication between the front-end and back-end development teams, which is essential for aligning the project components.</w:t>
+          <w:u w:val="none"/>
+        </w:rPr>
+      </w:pPr>
+      <w:r>
+        <w:rPr>
+          <w:sz w:val="18"/>
+          <w:szCs w:val="18"/>
+          <w:rtl w:val="0"/>
+        </w:rPr>
+        <w:t xml:space="preserve">Missing the milestone of integrating external feedback could lead to a misalignment between project requirements and actual implementation. Without incorporating suggestions from other groups early on, the project may overlook key requirements or necessary adjustments, impacting its final quality and user satisfaction. </w:t>
       </w:r>
     </w:p>
     <w:p>
@@ -1005,37 +1159,16 @@
         <w:rPr>
           <w:sz w:val="18"/>
           <w:szCs w:val="18"/>
-        </w:rPr>
-      </w:pPr>
-      <w:r>
-        <w:rPr>
-          <w:sz w:val="18"/>
-          <w:szCs w:val="18"/>
-          <w:rtl w:val="0"/>
-        </w:rPr>
-        <w:t xml:space="preserve">Unrealistic Deadlines:</w:t>
-      </w:r>
-    </w:p>
-    <w:p>
-      <w:pPr>
-        <w:numPr>
-          <w:ilvl w:val="1"/>
-          <w:numId w:val="1"/>
-        </w:numPr>
-        <w:spacing w:after="0" w:afterAutospacing="0" w:line="360" w:lineRule="auto"/>
-        <w:ind w:left="1440" w:hanging="360"/>
-        <w:rPr>
-          <w:sz w:val="18"/>
-          <w:szCs w:val="18"/>
-        </w:rPr>
-      </w:pPr>
-      <w:r>
-        <w:rPr>
-          <w:sz w:val="18"/>
-          <w:szCs w:val="18"/>
-          <w:rtl w:val="0"/>
-        </w:rPr>
-        <w:t xml:space="preserve">Bug testing and design review are scheduled too close to the final deadline, leaving insufficient time for proper issue resolution.</w:t>
+          <w:u w:val="none"/>
+        </w:rPr>
+      </w:pPr>
+      <w:r>
+        <w:rPr>
+          <w:sz w:val="18"/>
+          <w:szCs w:val="18"/>
+          <w:rtl w:val="0"/>
+        </w:rPr>
+        <w:t xml:space="preserve">The lack of planned coordination between the front-end and back-end teams can result in inconsistent features or integration issues. Without regular check-ins and updates, different components of the project might not align properly, creating delays and requiring additional time to create test cases and identify issues if present.</w:t>
       </w:r>
     </w:p>
     <w:p>
@@ -1049,43 +1182,80 @@
         <w:rPr>
           <w:sz w:val="18"/>
           <w:szCs w:val="18"/>
-        </w:rPr>
-      </w:pPr>
-      <w:r>
-        <w:rPr>
-          <w:sz w:val="18"/>
-          <w:szCs w:val="18"/>
-          <w:rtl w:val="0"/>
-        </w:rPr>
-        <w:t xml:space="preserve">Task Dependencies:</w:t>
+          <w:u w:val="none"/>
+        </w:rPr>
+      </w:pPr>
+      <w:r>
+        <w:rPr>
+          <w:sz w:val="18"/>
+          <w:szCs w:val="18"/>
+          <w:rtl w:val="0"/>
+        </w:rPr>
+        <w:t xml:space="preserve">Conducting bug testing and design review right before the final deadline is a high-risk strategy. This tight schedule increases the chance of unresolved issues in the final product. Allocating more time for testing earlier on in the timeline would have been a better approach to help mitigate any risks.</w:t>
       </w:r>
     </w:p>
     <w:p>
       <w:pPr>
         <w:numPr>
-          <w:ilvl w:val="1"/>
+          <w:ilvl w:val="0"/>
           <w:numId w:val="1"/>
         </w:numPr>
         <w:spacing w:after="160" w:line="360" w:lineRule="auto"/>
-        <w:ind w:left="1440" w:hanging="360"/>
-        <w:rPr>
-          <w:sz w:val="18"/>
-          <w:szCs w:val="18"/>
-        </w:rPr>
-      </w:pPr>
-      <w:r>
-        <w:rPr>
-          <w:sz w:val="18"/>
-          <w:szCs w:val="18"/>
-          <w:rtl w:val="0"/>
-        </w:rPr>
-        <w:t xml:space="preserve">The front-end team requires input from the authentication team to complete the login/registration page by November 20. Any delay in this data handoff could hinder the front-end team’s progress and push back the timeline.</w:t>
-      </w:r>
-    </w:p>
-    <w:p>
-      <w:pPr>
-        <w:spacing w:after="160" w:line="360" w:lineRule="auto"/>
+        <w:ind w:left="720" w:hanging="360"/>
+        <w:rPr>
+          <w:sz w:val="18"/>
+          <w:szCs w:val="18"/>
+          <w:u w:val="none"/>
+        </w:rPr>
+      </w:pPr>
+      <w:r>
+        <w:rPr>
+          <w:sz w:val="18"/>
+          <w:szCs w:val="18"/>
+          <w:rtl w:val="0"/>
+        </w:rPr>
+        <w:t xml:space="preserve">The strong dependency between the front-end and authentication teams creates a potential stoppage. If the authentication team cannot provide the necessary data on time, the front-end team will be unable to complete the login/registration page by the deadline of November 20th. This delay could cascade, affecting other deliverables and potentially pushing back the entire project timeline.</w:t>
+      </w:r>
+    </w:p>
+    <w:p>
+      <w:pPr>
+        <w:spacing w:after="160" w:lineRule="auto"/>
         <w:ind w:left="0" w:firstLine="0"/>
+        <w:rPr>
+          <w:b w:val="1"/>
+          <w:color w:val="3f6caf"/>
+          <w:sz w:val="18"/>
+          <w:szCs w:val="18"/>
+        </w:rPr>
+      </w:pPr>
+      <w:r>
+        <w:rPr>
+          <w:b w:val="1"/>
+          <w:color w:val="3f6caf"/>
+          <w:sz w:val="18"/>
+          <w:szCs w:val="18"/>
+          <w:rtl w:val="0"/>
+        </w:rPr>
+        <w:t xml:space="preserve">2.2 Additional Risks and Considerations</w:t>
+      </w:r>
+    </w:p>
+    <w:p>
+      <w:pPr>
+        <w:spacing w:after="160" w:lineRule="auto"/>
+        <w:rPr>
+          <w:sz w:val="17"/>
+          <w:szCs w:val="17"/>
+        </w:rPr>
+      </w:pPr>
+      <w:r>
+        <w:rPr>
+          <w:rtl w:val="0"/>
+        </w:rPr>
+      </w:r>
+    </w:p>
+    <w:p>
+      <w:pPr>
+        <w:spacing w:after="160" w:lineRule="auto"/>
         <w:rPr>
           <w:b w:val="1"/>
           <w:color w:val="3f6caf"/>
@@ -1101,14 +1271,13 @@
           <w:szCs w:val="24"/>
           <w:rtl w:val="0"/>
         </w:rPr>
-        <w:t xml:space="preserve">2. Highlighting Potential Risks</w:t>
+        <w:t xml:space="preserve">3. Suggestions for Improvement</w:t>
       </w:r>
     </w:p>
     <w:p>
       <w:pPr>
         <w:spacing w:after="160" w:lineRule="auto"/>
         <w:rPr>
-          <w:color w:val="13284b"/>
           <w:sz w:val="18"/>
           <w:szCs w:val="18"/>
         </w:rPr>
@@ -1121,89 +1290,465 @@
           <w:szCs w:val="18"/>
           <w:rtl w:val="0"/>
         </w:rPr>
-        <w:t xml:space="preserve">2.1 Key Risks Impacting Completion</w:t>
-      </w:r>
-      <w:r>
-        <w:rPr>
-          <w:rtl w:val="0"/>
-        </w:rPr>
-      </w:r>
-    </w:p>
+        <w:t xml:space="preserve">3.1 Timeline and Task Reordering</w:t>
+      </w:r>
+      <w:r>
+        <w:rPr>
+          <w:rtl w:val="0"/>
+        </w:rPr>
+      </w:r>
+    </w:p>
+    <w:tbl>
+      <w:tblPr>
+        <w:tblStyle w:val="Table2"/>
+        <w:tblW w:w="9135.0" w:type="dxa"/>
+        <w:jc w:val="left"/>
+        <w:tblBorders>
+          <w:top w:color="000000" w:space="0" w:sz="4" w:val="single"/>
+          <w:left w:color="000000" w:space="0" w:sz="4" w:val="single"/>
+          <w:bottom w:color="000000" w:space="0" w:sz="4" w:val="single"/>
+          <w:right w:color="000000" w:space="0" w:sz="4" w:val="single"/>
+          <w:insideH w:color="000000" w:space="0" w:sz="4" w:val="single"/>
+          <w:insideV w:color="000000" w:space="0" w:sz="4" w:val="single"/>
+        </w:tblBorders>
+        <w:tblLayout w:type="fixed"/>
+        <w:tblLook w:val="0600"/>
+      </w:tblPr>
+      <w:tblGrid>
+        <w:gridCol w:w="3015"/>
+        <w:gridCol w:w="3150"/>
+        <w:gridCol w:w="2970"/>
+        <w:tblGridChange w:id="0">
+          <w:tblGrid>
+            <w:gridCol w:w="3015"/>
+            <w:gridCol w:w="3150"/>
+            <w:gridCol w:w="2970"/>
+          </w:tblGrid>
+        </w:tblGridChange>
+      </w:tblGrid>
+      <w:tr>
+        <w:trPr>
+          <w:cantSplit w:val="0"/>
+          <w:trHeight w:val="519.805908203125" w:hRule="atLeast"/>
+          <w:tblHeader w:val="0"/>
+        </w:trPr>
+        <w:tc>
+          <w:tcPr>
+            <w:tcBorders>
+              <w:top w:color="000000" w:space="0" w:sz="4" w:val="single"/>
+              <w:left w:color="000000" w:space="0" w:sz="4" w:val="single"/>
+              <w:bottom w:color="000000" w:space="0" w:sz="4" w:val="single"/>
+              <w:right w:color="000000" w:space="0" w:sz="4" w:val="single"/>
+            </w:tcBorders>
+            <w:tcMar>
+              <w:top w:w="60.0" w:type="dxa"/>
+              <w:left w:w="60.0" w:type="dxa"/>
+              <w:bottom w:w="60.0" w:type="dxa"/>
+              <w:right w:w="60.0" w:type="dxa"/>
+            </w:tcMar>
+            <w:vAlign w:val="top"/>
+          </w:tcPr>
+          <w:p>
+            <w:pPr>
+              <w:spacing w:after="160" w:lineRule="auto"/>
+              <w:rPr>
+                <w:sz w:val="17"/>
+                <w:szCs w:val="17"/>
+              </w:rPr>
+            </w:pPr>
+            <w:r>
+              <w:rPr>
+                <w:sz w:val="17"/>
+                <w:szCs w:val="17"/>
+                <w:rtl w:val="0"/>
+              </w:rPr>
+              <w:t xml:space="preserve">Suggested Change</w:t>
+            </w:r>
+          </w:p>
+        </w:tc>
+        <w:tc>
+          <w:tcPr>
+            <w:tcBorders>
+              <w:top w:color="000000" w:space="0" w:sz="4" w:val="single"/>
+              <w:left w:color="000000" w:space="0" w:sz="4" w:val="single"/>
+              <w:bottom w:color="000000" w:space="0" w:sz="4" w:val="single"/>
+              <w:right w:color="000000" w:space="0" w:sz="4" w:val="single"/>
+            </w:tcBorders>
+            <w:tcMar>
+              <w:top w:w="60.0" w:type="dxa"/>
+              <w:left w:w="60.0" w:type="dxa"/>
+              <w:bottom w:w="60.0" w:type="dxa"/>
+              <w:right w:w="60.0" w:type="dxa"/>
+            </w:tcMar>
+            <w:vAlign w:val="top"/>
+          </w:tcPr>
+          <w:p>
+            <w:pPr>
+              <w:spacing w:after="160" w:lineRule="auto"/>
+              <w:rPr>
+                <w:sz w:val="17"/>
+                <w:szCs w:val="17"/>
+              </w:rPr>
+            </w:pPr>
+            <w:r>
+              <w:rPr>
+                <w:sz w:val="17"/>
+                <w:szCs w:val="17"/>
+                <w:rtl w:val="0"/>
+              </w:rPr>
+              <w:t xml:space="preserve">Rationale</w:t>
+            </w:r>
+          </w:p>
+        </w:tc>
+        <w:tc>
+          <w:tcPr>
+            <w:tcBorders>
+              <w:top w:color="000000" w:space="0" w:sz="4" w:val="single"/>
+              <w:left w:color="000000" w:space="0" w:sz="4" w:val="single"/>
+              <w:bottom w:color="000000" w:space="0" w:sz="4" w:val="single"/>
+              <w:right w:color="000000" w:space="0" w:sz="4" w:val="single"/>
+            </w:tcBorders>
+            <w:tcMar>
+              <w:top w:w="60.0" w:type="dxa"/>
+              <w:left w:w="60.0" w:type="dxa"/>
+              <w:bottom w:w="60.0" w:type="dxa"/>
+              <w:right w:w="60.0" w:type="dxa"/>
+            </w:tcMar>
+            <w:vAlign w:val="top"/>
+          </w:tcPr>
+          <w:p>
+            <w:pPr>
+              <w:spacing w:after="160" w:lineRule="auto"/>
+              <w:rPr>
+                <w:sz w:val="17"/>
+                <w:szCs w:val="17"/>
+              </w:rPr>
+            </w:pPr>
+            <w:r>
+              <w:rPr>
+                <w:sz w:val="17"/>
+                <w:szCs w:val="17"/>
+                <w:rtl w:val="0"/>
+              </w:rPr>
+              <w:t xml:space="preserve">Expected Outcome</w:t>
+            </w:r>
+          </w:p>
+        </w:tc>
+      </w:tr>
+      <w:tr>
+        <w:trPr>
+          <w:cantSplit w:val="0"/>
+          <w:trHeight w:val="840" w:hRule="atLeast"/>
+          <w:tblHeader w:val="0"/>
+        </w:trPr>
+        <w:tc>
+          <w:tcPr>
+            <w:tcBorders>
+              <w:top w:color="000000" w:space="0" w:sz="4" w:val="single"/>
+              <w:left w:color="000000" w:space="0" w:sz="4" w:val="single"/>
+              <w:bottom w:color="000000" w:space="0" w:sz="4" w:val="single"/>
+              <w:right w:color="000000" w:space="0" w:sz="4" w:val="single"/>
+            </w:tcBorders>
+            <w:tcMar>
+              <w:top w:w="60.0" w:type="dxa"/>
+              <w:left w:w="60.0" w:type="dxa"/>
+              <w:bottom w:w="60.0" w:type="dxa"/>
+              <w:right w:w="60.0" w:type="dxa"/>
+            </w:tcMar>
+            <w:vAlign w:val="top"/>
+          </w:tcPr>
+          <w:p>
+            <w:pPr>
+              <w:spacing w:after="160" w:lineRule="auto"/>
+              <w:rPr>
+                <w:sz w:val="17"/>
+                <w:szCs w:val="17"/>
+              </w:rPr>
+            </w:pPr>
+            <w:r>
+              <w:rPr>
+                <w:rtl w:val="0"/>
+              </w:rPr>
+            </w:r>
+          </w:p>
+        </w:tc>
+        <w:tc>
+          <w:tcPr>
+            <w:tcBorders>
+              <w:top w:color="000000" w:space="0" w:sz="4" w:val="single"/>
+              <w:left w:color="000000" w:space="0" w:sz="4" w:val="single"/>
+              <w:bottom w:color="000000" w:space="0" w:sz="4" w:val="single"/>
+              <w:right w:color="000000" w:space="0" w:sz="4" w:val="single"/>
+            </w:tcBorders>
+            <w:tcMar>
+              <w:top w:w="60.0" w:type="dxa"/>
+              <w:left w:w="60.0" w:type="dxa"/>
+              <w:bottom w:w="60.0" w:type="dxa"/>
+              <w:right w:w="60.0" w:type="dxa"/>
+            </w:tcMar>
+            <w:vAlign w:val="top"/>
+          </w:tcPr>
+          <w:p>
+            <w:pPr>
+              <w:spacing w:after="160" w:lineRule="auto"/>
+              <w:rPr>
+                <w:sz w:val="17"/>
+                <w:szCs w:val="17"/>
+              </w:rPr>
+            </w:pPr>
+            <w:r>
+              <w:rPr>
+                <w:rtl w:val="0"/>
+              </w:rPr>
+            </w:r>
+          </w:p>
+        </w:tc>
+        <w:tc>
+          <w:tcPr>
+            <w:tcBorders>
+              <w:top w:color="000000" w:space="0" w:sz="4" w:val="single"/>
+              <w:left w:color="000000" w:space="0" w:sz="4" w:val="single"/>
+              <w:bottom w:color="000000" w:space="0" w:sz="4" w:val="single"/>
+              <w:right w:color="000000" w:space="0" w:sz="4" w:val="single"/>
+            </w:tcBorders>
+            <w:tcMar>
+              <w:top w:w="60.0" w:type="dxa"/>
+              <w:left w:w="60.0" w:type="dxa"/>
+              <w:bottom w:w="60.0" w:type="dxa"/>
+              <w:right w:w="60.0" w:type="dxa"/>
+            </w:tcMar>
+            <w:vAlign w:val="top"/>
+          </w:tcPr>
+          <w:p>
+            <w:pPr>
+              <w:spacing w:after="160" w:lineRule="auto"/>
+              <w:ind w:right="0"/>
+              <w:rPr>
+                <w:sz w:val="17"/>
+                <w:szCs w:val="17"/>
+              </w:rPr>
+            </w:pPr>
+            <w:r>
+              <w:rPr>
+                <w:rtl w:val="0"/>
+              </w:rPr>
+            </w:r>
+          </w:p>
+        </w:tc>
+      </w:tr>
+      <w:tr>
+        <w:trPr>
+          <w:cantSplit w:val="0"/>
+          <w:trHeight w:val="645" w:hRule="atLeast"/>
+          <w:tblHeader w:val="0"/>
+        </w:trPr>
+        <w:tc>
+          <w:tcPr>
+            <w:tcBorders>
+              <w:top w:color="000000" w:space="0" w:sz="4" w:val="single"/>
+              <w:left w:color="000000" w:space="0" w:sz="4" w:val="single"/>
+              <w:bottom w:color="000000" w:space="0" w:sz="4" w:val="single"/>
+              <w:right w:color="000000" w:space="0" w:sz="4" w:val="single"/>
+            </w:tcBorders>
+            <w:tcMar>
+              <w:top w:w="60.0" w:type="dxa"/>
+              <w:left w:w="60.0" w:type="dxa"/>
+              <w:bottom w:w="60.0" w:type="dxa"/>
+              <w:right w:w="60.0" w:type="dxa"/>
+            </w:tcMar>
+            <w:vAlign w:val="top"/>
+          </w:tcPr>
+          <w:p>
+            <w:pPr>
+              <w:spacing w:after="160" w:lineRule="auto"/>
+              <w:rPr>
+                <w:sz w:val="17"/>
+                <w:szCs w:val="17"/>
+              </w:rPr>
+            </w:pPr>
+            <w:r>
+              <w:rPr>
+                <w:rtl w:val="0"/>
+              </w:rPr>
+            </w:r>
+          </w:p>
+        </w:tc>
+        <w:tc>
+          <w:tcPr>
+            <w:tcBorders>
+              <w:top w:color="000000" w:space="0" w:sz="4" w:val="single"/>
+              <w:left w:color="000000" w:space="0" w:sz="4" w:val="single"/>
+              <w:bottom w:color="000000" w:space="0" w:sz="4" w:val="single"/>
+              <w:right w:color="000000" w:space="0" w:sz="4" w:val="single"/>
+            </w:tcBorders>
+            <w:tcMar>
+              <w:top w:w="60.0" w:type="dxa"/>
+              <w:left w:w="60.0" w:type="dxa"/>
+              <w:bottom w:w="60.0" w:type="dxa"/>
+              <w:right w:w="60.0" w:type="dxa"/>
+            </w:tcMar>
+            <w:vAlign w:val="top"/>
+          </w:tcPr>
+          <w:p>
+            <w:pPr>
+              <w:spacing w:after="160" w:lineRule="auto"/>
+              <w:rPr>
+                <w:sz w:val="17"/>
+                <w:szCs w:val="17"/>
+              </w:rPr>
+            </w:pPr>
+            <w:r>
+              <w:rPr>
+                <w:rtl w:val="0"/>
+              </w:rPr>
+            </w:r>
+          </w:p>
+        </w:tc>
+        <w:tc>
+          <w:tcPr>
+            <w:tcBorders>
+              <w:top w:color="000000" w:space="0" w:sz="4" w:val="single"/>
+              <w:left w:color="000000" w:space="0" w:sz="4" w:val="single"/>
+              <w:bottom w:color="000000" w:space="0" w:sz="4" w:val="single"/>
+              <w:right w:color="000000" w:space="0" w:sz="4" w:val="single"/>
+            </w:tcBorders>
+            <w:tcMar>
+              <w:top w:w="60.0" w:type="dxa"/>
+              <w:left w:w="60.0" w:type="dxa"/>
+              <w:bottom w:w="60.0" w:type="dxa"/>
+              <w:right w:w="60.0" w:type="dxa"/>
+            </w:tcMar>
+            <w:vAlign w:val="top"/>
+          </w:tcPr>
+          <w:p>
+            <w:pPr>
+              <w:spacing w:after="160" w:lineRule="auto"/>
+              <w:rPr>
+                <w:sz w:val="17"/>
+                <w:szCs w:val="17"/>
+              </w:rPr>
+            </w:pPr>
+            <w:r>
+              <w:rPr>
+                <w:rtl w:val="0"/>
+              </w:rPr>
+            </w:r>
+          </w:p>
+        </w:tc>
+      </w:tr>
+      <w:tr>
+        <w:trPr>
+          <w:cantSplit w:val="0"/>
+          <w:trHeight w:val="840" w:hRule="atLeast"/>
+          <w:tblHeader w:val="0"/>
+        </w:trPr>
+        <w:tc>
+          <w:tcPr>
+            <w:tcBorders>
+              <w:top w:color="000000" w:space="0" w:sz="4" w:val="single"/>
+              <w:left w:color="000000" w:space="0" w:sz="4" w:val="single"/>
+              <w:bottom w:color="000000" w:space="0" w:sz="4" w:val="single"/>
+              <w:right w:color="000000" w:space="0" w:sz="4" w:val="single"/>
+            </w:tcBorders>
+            <w:tcMar>
+              <w:top w:w="60.0" w:type="dxa"/>
+              <w:left w:w="60.0" w:type="dxa"/>
+              <w:bottom w:w="60.0" w:type="dxa"/>
+              <w:right w:w="60.0" w:type="dxa"/>
+            </w:tcMar>
+            <w:vAlign w:val="top"/>
+          </w:tcPr>
+          <w:p>
+            <w:pPr>
+              <w:spacing w:after="160" w:lineRule="auto"/>
+              <w:rPr>
+                <w:sz w:val="17"/>
+                <w:szCs w:val="17"/>
+              </w:rPr>
+            </w:pPr>
+            <w:r>
+              <w:rPr>
+                <w:rtl w:val="0"/>
+              </w:rPr>
+            </w:r>
+          </w:p>
+        </w:tc>
+        <w:tc>
+          <w:tcPr>
+            <w:tcBorders>
+              <w:top w:color="000000" w:space="0" w:sz="4" w:val="single"/>
+              <w:left w:color="000000" w:space="0" w:sz="4" w:val="single"/>
+              <w:bottom w:color="000000" w:space="0" w:sz="4" w:val="single"/>
+              <w:right w:color="000000" w:space="0" w:sz="4" w:val="single"/>
+            </w:tcBorders>
+            <w:tcMar>
+              <w:top w:w="60.0" w:type="dxa"/>
+              <w:left w:w="60.0" w:type="dxa"/>
+              <w:bottom w:w="60.0" w:type="dxa"/>
+              <w:right w:w="60.0" w:type="dxa"/>
+            </w:tcMar>
+            <w:vAlign w:val="top"/>
+          </w:tcPr>
+          <w:p>
+            <w:pPr>
+              <w:spacing w:after="160" w:lineRule="auto"/>
+              <w:rPr>
+                <w:sz w:val="17"/>
+                <w:szCs w:val="17"/>
+              </w:rPr>
+            </w:pPr>
+            <w:r>
+              <w:rPr>
+                <w:rtl w:val="0"/>
+              </w:rPr>
+            </w:r>
+          </w:p>
+        </w:tc>
+        <w:tc>
+          <w:tcPr>
+            <w:tcBorders>
+              <w:top w:color="000000" w:space="0" w:sz="4" w:val="single"/>
+              <w:left w:color="000000" w:space="0" w:sz="4" w:val="single"/>
+              <w:bottom w:color="000000" w:space="0" w:sz="4" w:val="single"/>
+              <w:right w:color="000000" w:space="0" w:sz="4" w:val="single"/>
+            </w:tcBorders>
+            <w:tcMar>
+              <w:top w:w="60.0" w:type="dxa"/>
+              <w:left w:w="60.0" w:type="dxa"/>
+              <w:bottom w:w="60.0" w:type="dxa"/>
+              <w:right w:w="60.0" w:type="dxa"/>
+            </w:tcMar>
+            <w:vAlign w:val="top"/>
+          </w:tcPr>
+          <w:p>
+            <w:pPr>
+              <w:spacing w:after="160" w:lineRule="auto"/>
+              <w:rPr>
+                <w:sz w:val="17"/>
+                <w:szCs w:val="17"/>
+              </w:rPr>
+            </w:pPr>
+            <w:r>
+              <w:rPr>
+                <w:rtl w:val="0"/>
+              </w:rPr>
+            </w:r>
+          </w:p>
+        </w:tc>
+      </w:tr>
+    </w:tbl>
     <w:p>
       <w:pPr>
         <w:spacing w:after="160" w:lineRule="auto"/>
         <w:rPr>
-          <w:b w:val="1"/>
-          <w:color w:val="3f6caf"/>
-          <w:sz w:val="18"/>
-          <w:szCs w:val="18"/>
-        </w:rPr>
-      </w:pPr>
-      <w:r>
-        <w:rPr>
-          <w:b w:val="1"/>
-          <w:color w:val="3f6caf"/>
-          <w:sz w:val="18"/>
-          <w:szCs w:val="18"/>
-          <w:rtl w:val="0"/>
-        </w:rPr>
-        <w:t xml:space="preserve">2.2 Additional Risks and Considerations</w:t>
-      </w:r>
-    </w:p>
-    <w:p>
-      <w:pPr>
-        <w:spacing w:after="160" w:lineRule="auto"/>
-        <w:rPr>
-          <w:sz w:val="17"/>
-          <w:szCs w:val="17"/>
-        </w:rPr>
-      </w:pPr>
-      <w:r>
-        <w:rPr>
-          <w:rtl w:val="0"/>
-        </w:rPr>
-      </w:r>
-    </w:p>
-    <w:p>
-      <w:pPr>
-        <w:spacing w:after="160" w:lineRule="auto"/>
-        <w:rPr>
-          <w:b w:val="1"/>
-          <w:color w:val="3f6caf"/>
-          <w:sz w:val="24"/>
-          <w:szCs w:val="24"/>
-        </w:rPr>
-      </w:pPr>
-      <w:r>
-        <w:rPr>
-          <w:b w:val="1"/>
-          <w:color w:val="3f6caf"/>
-          <w:sz w:val="24"/>
-          <w:szCs w:val="24"/>
-          <w:rtl w:val="0"/>
-        </w:rPr>
-        <w:t xml:space="preserve">3. Suggestions for Improvement</w:t>
-      </w:r>
-    </w:p>
-    <w:p>
-      <w:pPr>
-        <w:spacing w:after="160" w:lineRule="auto"/>
-        <w:rPr>
-          <w:b w:val="1"/>
-          <w:color w:val="3f6caf"/>
-          <w:sz w:val="18"/>
-          <w:szCs w:val="18"/>
-        </w:rPr>
-      </w:pPr>
-      <w:r>
-        <w:rPr>
-          <w:b w:val="1"/>
-          <w:color w:val="3f6caf"/>
-          <w:sz w:val="18"/>
-          <w:szCs w:val="18"/>
-          <w:rtl w:val="0"/>
-        </w:rPr>
-        <w:t xml:space="preserve">3.1 Timeline and Task Reordering</w:t>
+          <w:sz w:val="18"/>
+          <w:szCs w:val="18"/>
+        </w:rPr>
+      </w:pPr>
+      <w:r>
+        <w:rPr>
+          <w:rtl w:val="0"/>
+        </w:rPr>
       </w:r>
     </w:p>
     <w:p>
@@ -1261,21 +1806,6 @@
         <w:rPr>
           <w:sz w:val="17"/>
           <w:szCs w:val="17"/>
-        </w:rPr>
-      </w:pPr>
-      <w:r>
-        <w:rPr>
-          <w:rtl w:val="0"/>
-        </w:rPr>
-      </w:r>
-    </w:p>
-    <w:p>
-      <w:pPr>
-        <w:spacing w:after="160" w:lineRule="auto"/>
-        <w:rPr>
-          <w:color w:val="13284b"/>
-          <w:sz w:val="39"/>
-          <w:szCs w:val="39"/>
         </w:rPr>
       </w:pPr>
       <w:r>
@@ -1308,6 +1838,116 @@
   <w:abstractNum w:abstractNumId="1">
     <w:lvl w:ilvl="0">
       <w:start w:val="1"/>
+      <w:numFmt w:val="decimal"/>
+      <w:lvlText w:val="%1."/>
+      <w:lvlJc w:val="left"/>
+      <w:pPr>
+        <w:ind w:left="720" w:hanging="360"/>
+      </w:pPr>
+      <w:rPr>
+        <w:u w:val="none"/>
+      </w:rPr>
+    </w:lvl>
+    <w:lvl w:ilvl="1">
+      <w:start w:val="1"/>
+      <w:numFmt w:val="lowerLetter"/>
+      <w:lvlText w:val="%2."/>
+      <w:lvlJc w:val="left"/>
+      <w:pPr>
+        <w:ind w:left="1440" w:hanging="360"/>
+      </w:pPr>
+      <w:rPr>
+        <w:u w:val="none"/>
+      </w:rPr>
+    </w:lvl>
+    <w:lvl w:ilvl="2">
+      <w:start w:val="1"/>
+      <w:numFmt w:val="lowerRoman"/>
+      <w:lvlText w:val="%3."/>
+      <w:lvlJc w:val="right"/>
+      <w:pPr>
+        <w:ind w:left="2160" w:hanging="360"/>
+      </w:pPr>
+      <w:rPr>
+        <w:u w:val="none"/>
+      </w:rPr>
+    </w:lvl>
+    <w:lvl w:ilvl="3">
+      <w:start w:val="1"/>
+      <w:numFmt w:val="decimal"/>
+      <w:lvlText w:val="%4."/>
+      <w:lvlJc w:val="left"/>
+      <w:pPr>
+        <w:ind w:left="2880" w:hanging="360"/>
+      </w:pPr>
+      <w:rPr>
+        <w:u w:val="none"/>
+      </w:rPr>
+    </w:lvl>
+    <w:lvl w:ilvl="4">
+      <w:start w:val="1"/>
+      <w:numFmt w:val="lowerLetter"/>
+      <w:lvlText w:val="%5."/>
+      <w:lvlJc w:val="left"/>
+      <w:pPr>
+        <w:ind w:left="3600" w:hanging="360"/>
+      </w:pPr>
+      <w:rPr>
+        <w:u w:val="none"/>
+      </w:rPr>
+    </w:lvl>
+    <w:lvl w:ilvl="5">
+      <w:start w:val="1"/>
+      <w:numFmt w:val="lowerRoman"/>
+      <w:lvlText w:val="%6."/>
+      <w:lvlJc w:val="right"/>
+      <w:pPr>
+        <w:ind w:left="4320" w:hanging="360"/>
+      </w:pPr>
+      <w:rPr>
+        <w:u w:val="none"/>
+      </w:rPr>
+    </w:lvl>
+    <w:lvl w:ilvl="6">
+      <w:start w:val="1"/>
+      <w:numFmt w:val="decimal"/>
+      <w:lvlText w:val="%7."/>
+      <w:lvlJc w:val="left"/>
+      <w:pPr>
+        <w:ind w:left="5040" w:hanging="360"/>
+      </w:pPr>
+      <w:rPr>
+        <w:u w:val="none"/>
+      </w:rPr>
+    </w:lvl>
+    <w:lvl w:ilvl="7">
+      <w:start w:val="1"/>
+      <w:numFmt w:val="lowerLetter"/>
+      <w:lvlText w:val="%8."/>
+      <w:lvlJc w:val="left"/>
+      <w:pPr>
+        <w:ind w:left="5760" w:hanging="360"/>
+      </w:pPr>
+      <w:rPr>
+        <w:u w:val="none"/>
+      </w:rPr>
+    </w:lvl>
+    <w:lvl w:ilvl="8">
+      <w:start w:val="1"/>
+      <w:numFmt w:val="lowerRoman"/>
+      <w:lvlText w:val="%9."/>
+      <w:lvlJc w:val="right"/>
+      <w:pPr>
+        <w:ind w:left="6480" w:hanging="360"/>
+      </w:pPr>
+      <w:rPr>
+        <w:u w:val="none"/>
+      </w:rPr>
+    </w:lvl>
+  </w:abstractNum>
+  <w:abstractNum w:abstractNumId="2">
+    <w:lvl w:ilvl="0">
+      <w:start w:val="1"/>
       <w:numFmt w:val="bullet"/>
       <w:lvlText w:val="●"/>
       <w:lvlJc w:val="left"/>
@@ -1417,6 +2057,9 @@
   </w:abstractNum>
   <w:num w:numId="1">
     <w:abstractNumId w:val="1"/>
+  </w:num>
+  <w:num w:numId="2">
+    <w:abstractNumId w:val="2"/>
   </w:num>
 </w:numbering>
 </file>
@@ -1575,6 +2218,55 @@
     </w:rPr>
   </w:style>
   <w:style w:type="table" w:styleId="Table1">
+    <w:basedOn w:val="TableNormal"/>
+    <w:tblPr>
+      <w:tblStyleRowBandSize w:val="1"/>
+      <w:tblStyleColBandSize w:val="1"/>
+      <w:tblCellMar>
+        <w:top w:w="100.0" w:type="dxa"/>
+        <w:left w:w="100.0" w:type="dxa"/>
+        <w:bottom w:w="100.0" w:type="dxa"/>
+        <w:right w:w="100.0" w:type="dxa"/>
+      </w:tblCellMar>
+    </w:tblPr>
+    <w:tblStylePr w:type="band1Horz">
+      <w:tcPr/>
+    </w:tblStylePr>
+    <w:tblStylePr w:type="band1Vert">
+      <w:tcPr/>
+    </w:tblStylePr>
+    <w:tblStylePr w:type="band2Horz">
+      <w:tcPr/>
+    </w:tblStylePr>
+    <w:tblStylePr w:type="band2Vert">
+      <w:tcPr/>
+    </w:tblStylePr>
+    <w:tblStylePr w:type="firstCol">
+      <w:tcPr/>
+    </w:tblStylePr>
+    <w:tblStylePr w:type="firstRow">
+      <w:tcPr/>
+    </w:tblStylePr>
+    <w:tblStylePr w:type="lastCol">
+      <w:tcPr/>
+    </w:tblStylePr>
+    <w:tblStylePr w:type="lastRow">
+      <w:tcPr/>
+    </w:tblStylePr>
+    <w:tblStylePr w:type="neCell">
+      <w:tcPr/>
+    </w:tblStylePr>
+    <w:tblStylePr w:type="nwCell">
+      <w:tcPr/>
+    </w:tblStylePr>
+    <w:tblStylePr w:type="seCell">
+      <w:tcPr/>
+    </w:tblStylePr>
+    <w:tblStylePr w:type="swCell">
+      <w:tcPr/>
+    </w:tblStylePr>
+  </w:style>
+  <w:style w:type="table" w:styleId="Table2">
     <w:basedOn w:val="TableNormal"/>
     <w:tblPr>
       <w:tblStyleRowBandSize w:val="1"/>

</xml_diff>

<commit_message>
Added rationale and expected outcome for integrated testing.
</commit_message>
<xml_diff>
--- a/Iteration_2/Echo_Review/final_submission/Planning_Review_Authentication_Team.docx
+++ b/Iteration_2/Echo_Review/final_submission/Planning_Review_Authentication_Team.docx
@@ -1348,6 +1348,13 @@
               </w:rPr>
               <w:t xml:space="preserve">Integrate testing throughout development </w:t>
             </w:r>
+            <w:r>
+              <w:rPr>
+                <w:sz w:val="17"/>
+                <w:szCs w:val="17"/>
+              </w:rPr>
+              <w:t>by using unit testing and integration testing</w:t>
+            </w:r>
           </w:p>
         </w:tc>
         <w:tc>
@@ -1374,6 +1381,27 @@
                 <w:szCs w:val="17"/>
               </w:rPr>
             </w:pPr>
+            <w:r>
+              <w:rPr>
+                <w:sz w:val="17"/>
+                <w:szCs w:val="17"/>
+              </w:rPr>
+              <w:t xml:space="preserve">Integrating testing throughout development would allow for earlier bug detection and resolution. Resolving the bug earlier in development would make it much less costly and compounding into other issues. </w:t>
+            </w:r>
+            <w:r>
+              <w:rPr>
+                <w:sz w:val="17"/>
+                <w:szCs w:val="17"/>
+              </w:rPr>
+              <w:t>Further, earlier integration testing would reveal any compatibility issues earlier in development.</w:t>
+            </w:r>
+            <w:r>
+              <w:rPr>
+                <w:sz w:val="17"/>
+                <w:szCs w:val="17"/>
+              </w:rPr>
+              <w:t xml:space="preserve"> Finally, implementing integrated testing supports agile software development.</w:t>
+            </w:r>
           </w:p>
         </w:tc>
         <w:tc>
@@ -1400,6 +1428,13 @@
                 <w:szCs w:val="17"/>
               </w:rPr>
             </w:pPr>
+            <w:r>
+              <w:rPr>
+                <w:sz w:val="17"/>
+                <w:szCs w:val="17"/>
+              </w:rPr>
+              <w:t>The quality of code throughout development would int turn, be higher and more stable. Early integration testing would minimize issues in interface compatibility. Further, delays due to unexpected issues would be minimized.</w:t>
+            </w:r>
           </w:p>
         </w:tc>
       </w:tr>
@@ -1526,6 +1561,7 @@
                 <w:sz w:val="17"/>
                 <w:szCs w:val="17"/>
               </w:rPr>
+              <w:lastRenderedPageBreak/>
               <w:t>Add additional buffer time for Bug and Design Review</w:t>
             </w:r>
           </w:p>

</xml_diff>

<commit_message>
Added rationale and expected outcome for code integration plan
</commit_message>
<xml_diff>
--- a/Iteration_2/Echo_Review/final_submission/Planning_Review_Authentication_Team.docx
+++ b/Iteration_2/Echo_Review/final_submission/Planning_Review_Authentication_Team.docx
@@ -1499,6 +1499,28 @@
                 <w:szCs w:val="17"/>
               </w:rPr>
             </w:pPr>
+            <w:r>
+              <w:rPr>
+                <w:sz w:val="17"/>
+                <w:szCs w:val="17"/>
+              </w:rPr>
+              <w:t xml:space="preserve">Following a code integration plan would ensure compatibility across teams since any inconsistencies between teams will </w:t>
+            </w:r>
+            <w:r>
+              <w:rPr>
+                <w:sz w:val="17"/>
+                <w:szCs w:val="17"/>
+              </w:rPr>
+              <w:lastRenderedPageBreak/>
+              <w:t xml:space="preserve">be revealed earlier in the development process, improving dependency management. When integrating components in smaller iterations, bugs and issues that arise will be easier to identify and less costly to resolve. Further, following a code integration plan would facilitate testing throughout development. Further, the code integration plan will encourage teams to </w:t>
+            </w:r>
+            <w:r>
+              <w:rPr>
+                <w:sz w:val="17"/>
+                <w:szCs w:val="17"/>
+              </w:rPr>
+              <w:t>stay on track and meet deadlines, reducing component delays.</w:t>
+            </w:r>
           </w:p>
         </w:tc>
         <w:tc>
@@ -1525,6 +1547,29 @@
                 <w:szCs w:val="17"/>
               </w:rPr>
             </w:pPr>
+            <w:r>
+              <w:rPr>
+                <w:sz w:val="17"/>
+                <w:szCs w:val="17"/>
+              </w:rPr>
+              <w:lastRenderedPageBreak/>
+              <w:t>Reduced late-stage integration issue</w:t>
+            </w:r>
+            <w:r>
+              <w:rPr>
+                <w:sz w:val="17"/>
+                <w:szCs w:val="17"/>
+              </w:rPr>
+              <w:t xml:space="preserve"> which will create higher quality code. </w:t>
+            </w:r>
+            <w:r>
+              <w:rPr>
+                <w:sz w:val="17"/>
+                <w:szCs w:val="17"/>
+              </w:rPr>
+              <w:lastRenderedPageBreak/>
+              <w:t xml:space="preserve">Reduced component delays will improve team collaboration.  </w:t>
+            </w:r>
           </w:p>
         </w:tc>
       </w:tr>
@@ -1561,7 +1606,6 @@
                 <w:sz w:val="17"/>
                 <w:szCs w:val="17"/>
               </w:rPr>
-              <w:lastRenderedPageBreak/>
               <w:t>Add additional buffer time for Bug and Design Review</w:t>
             </w:r>
           </w:p>

</xml_diff>

<commit_message>
Added integrate testing throughout development to Resource and Allocation Suggestions
</commit_message>
<xml_diff>
--- a/Iteration_2/Echo_Review/final_submission/Planning_Review_Authentication_Team.docx
+++ b/Iteration_2/Echo_Review/final_submission/Planning_Review_Authentication_Team.docx
@@ -1804,6 +1804,131 @@
         </w:rPr>
       </w:pPr>
     </w:p>
+    <w:tbl>
+      <w:tblPr>
+        <w:tblStyle w:val="a0"/>
+        <w:tblW w:w="9135" w:type="dxa"/>
+        <w:tblBorders>
+          <w:top w:val="single" w:sz="4" w:space="0" w:color="000000"/>
+          <w:left w:val="single" w:sz="4" w:space="0" w:color="000000"/>
+          <w:bottom w:val="single" w:sz="4" w:space="0" w:color="000000"/>
+          <w:right w:val="single" w:sz="4" w:space="0" w:color="000000"/>
+          <w:insideH w:val="single" w:sz="4" w:space="0" w:color="000000"/>
+          <w:insideV w:val="single" w:sz="4" w:space="0" w:color="000000"/>
+        </w:tblBorders>
+        <w:tblLayout w:type="fixed"/>
+        <w:tblLook w:val="0600" w:firstRow="0" w:lastRow="0" w:firstColumn="0" w:lastColumn="0" w:noHBand="1" w:noVBand="1"/>
+      </w:tblPr>
+      <w:tblGrid>
+        <w:gridCol w:w="3015"/>
+        <w:gridCol w:w="3150"/>
+        <w:gridCol w:w="2970"/>
+      </w:tblGrid>
+      <w:tr>
+        <w:trPr>
+          <w:trHeight w:val="840"/>
+        </w:trPr>
+        <w:tc>
+          <w:tcPr>
+            <w:tcW w:w="3015" w:type="dxa"/>
+            <w:tcBorders>
+              <w:top w:val="single" w:sz="4" w:space="0" w:color="000000"/>
+              <w:left w:val="single" w:sz="4" w:space="0" w:color="000000"/>
+              <w:bottom w:val="single" w:sz="4" w:space="0" w:color="000000"/>
+              <w:right w:val="single" w:sz="4" w:space="0" w:color="000000"/>
+            </w:tcBorders>
+            <w:tcMar>
+              <w:top w:w="60" w:type="dxa"/>
+              <w:left w:w="60" w:type="dxa"/>
+              <w:bottom w:w="60" w:type="dxa"/>
+              <w:right w:w="60" w:type="dxa"/>
+            </w:tcMar>
+          </w:tcPr>
+          <w:p>
+            <w:pPr>
+              <w:spacing w:after="160"/>
+              <w:rPr>
+                <w:sz w:val="17"/>
+                <w:szCs w:val="17"/>
+              </w:rPr>
+            </w:pPr>
+            <w:r>
+              <w:rPr>
+                <w:sz w:val="17"/>
+                <w:szCs w:val="17"/>
+              </w:rPr>
+              <w:t>Integrate testing throughout development by using unit testing and integration testing</w:t>
+            </w:r>
+          </w:p>
+        </w:tc>
+        <w:tc>
+          <w:tcPr>
+            <w:tcW w:w="3150" w:type="dxa"/>
+            <w:tcBorders>
+              <w:top w:val="single" w:sz="4" w:space="0" w:color="000000"/>
+              <w:left w:val="single" w:sz="4" w:space="0" w:color="000000"/>
+              <w:bottom w:val="single" w:sz="4" w:space="0" w:color="000000"/>
+              <w:right w:val="single" w:sz="4" w:space="0" w:color="000000"/>
+            </w:tcBorders>
+            <w:tcMar>
+              <w:top w:w="60" w:type="dxa"/>
+              <w:left w:w="60" w:type="dxa"/>
+              <w:bottom w:w="60" w:type="dxa"/>
+              <w:right w:w="60" w:type="dxa"/>
+            </w:tcMar>
+          </w:tcPr>
+          <w:p>
+            <w:pPr>
+              <w:spacing w:after="160"/>
+              <w:rPr>
+                <w:sz w:val="17"/>
+                <w:szCs w:val="17"/>
+              </w:rPr>
+            </w:pPr>
+            <w:r>
+              <w:rPr>
+                <w:sz w:val="17"/>
+                <w:szCs w:val="17"/>
+              </w:rPr>
+              <w:t>This suggestion fall under Resource and Allocation Suggestions as well since it is suggesting additional tests and therefore resources to be used.</w:t>
+            </w:r>
+          </w:p>
+        </w:tc>
+        <w:tc>
+          <w:tcPr>
+            <w:tcW w:w="2970" w:type="dxa"/>
+            <w:tcBorders>
+              <w:top w:val="single" w:sz="4" w:space="0" w:color="000000"/>
+              <w:left w:val="single" w:sz="4" w:space="0" w:color="000000"/>
+              <w:bottom w:val="single" w:sz="4" w:space="0" w:color="000000"/>
+              <w:right w:val="single" w:sz="4" w:space="0" w:color="000000"/>
+            </w:tcBorders>
+            <w:tcMar>
+              <w:top w:w="60" w:type="dxa"/>
+              <w:left w:w="60" w:type="dxa"/>
+              <w:bottom w:w="60" w:type="dxa"/>
+              <w:right w:w="60" w:type="dxa"/>
+            </w:tcMar>
+          </w:tcPr>
+          <w:p>
+            <w:pPr>
+              <w:spacing w:after="160"/>
+              <w:rPr>
+                <w:sz w:val="17"/>
+                <w:szCs w:val="17"/>
+              </w:rPr>
+            </w:pPr>
+            <w:r>
+              <w:rPr>
+                <w:sz w:val="17"/>
+                <w:szCs w:val="17"/>
+              </w:rPr>
+              <w:t>The quality of code throughout development would int turn, be higher and more stable. Early integration testing would minimize issues in interface compatibility. Further, delays due to unexpected issues would be minimized.</w:t>
+            </w:r>
+          </w:p>
+        </w:tc>
+      </w:tr>
+    </w:tbl>
     <w:p/>
     <w:sectPr>
       <w:pgSz w:w="12240" w:h="15840"/>

</xml_diff>

<commit_message>
Removed section 2.2 and fixed minor errors.
</commit_message>
<xml_diff>
--- a/Iteration_2/Echo_Review/final_submission/Planning_Review_Authentication_Team.docx
+++ b/Iteration_2/Echo_Review/final_submission/Planning_Review_Authentication_Team.docx
@@ -1128,35 +1128,6 @@
         <w:rPr>
           <w:b/>
           <w:color w:val="3F6CAF"/>
-          <w:sz w:val="18"/>
-          <w:szCs w:val="18"/>
-        </w:rPr>
-      </w:pPr>
-      <w:r>
-        <w:rPr>
-          <w:b/>
-          <w:color w:val="3F6CAF"/>
-          <w:sz w:val="18"/>
-          <w:szCs w:val="18"/>
-        </w:rPr>
-        <w:t>2.2 Additional Risks and Considerations</w:t>
-      </w:r>
-    </w:p>
-    <w:p>
-      <w:pPr>
-        <w:spacing w:after="160"/>
-        <w:rPr>
-          <w:sz w:val="17"/>
-          <w:szCs w:val="17"/>
-        </w:rPr>
-      </w:pPr>
-    </w:p>
-    <w:p>
-      <w:pPr>
-        <w:spacing w:after="160"/>
-        <w:rPr>
-          <w:b/>
-          <w:color w:val="3F6CAF"/>
           <w:sz w:val="24"/>
           <w:szCs w:val="24"/>
         </w:rPr>
@@ -1433,7 +1404,14 @@
                 <w:sz w:val="17"/>
                 <w:szCs w:val="17"/>
               </w:rPr>
-              <w:t>The quality of code throughout development would int turn, be higher and more stable. Early integration testing would minimize issues in interface compatibility. Further, delays due to unexpected issues would be minimized.</w:t>
+              <w:t xml:space="preserve">The quality of code throughout development would in turn, be higher and more stable. Early integration testing would minimize issues in interface compatibility. </w:t>
+            </w:r>
+            <w:r>
+              <w:rPr>
+                <w:sz w:val="17"/>
+                <w:szCs w:val="17"/>
+              </w:rPr>
+              <w:t>Delays due to unexpected issues would be minimized.</w:t>
             </w:r>
           </w:p>
         </w:tc>
@@ -1504,7 +1482,7 @@
                 <w:sz w:val="17"/>
                 <w:szCs w:val="17"/>
               </w:rPr>
-              <w:t xml:space="preserve">Following a code integration plan would ensure compatibility across teams since any inconsistencies between teams will </w:t>
+              <w:t xml:space="preserve">Following a code integration plan would ensure compatibility across teams since any inconsistencies between teams will be revealed earlier in the development process, improving dependency management. When integrating components in smaller iterations, bugs </w:t>
             </w:r>
             <w:r>
               <w:rPr>
@@ -1512,7 +1490,21 @@
                 <w:szCs w:val="17"/>
               </w:rPr>
               <w:lastRenderedPageBreak/>
-              <w:t xml:space="preserve">be revealed earlier in the development process, improving dependency management. When integrating components in smaller iterations, bugs and issues that arise will be easier to identify and less costly to resolve. Further, following a code integration plan would facilitate testing throughout development. Further, the code integration plan will encourage teams to </w:t>
+              <w:t xml:space="preserve">and issues that arise will be easier to identify and less costly to resolve. Further, following a code integration plan would facilitate testing throughout development. </w:t>
+            </w:r>
+            <w:r>
+              <w:rPr>
+                <w:sz w:val="17"/>
+                <w:szCs w:val="17"/>
+              </w:rPr>
+              <w:t>T</w:t>
+            </w:r>
+            <w:r>
+              <w:rPr>
+                <w:sz w:val="17"/>
+                <w:szCs w:val="17"/>
+              </w:rPr>
+              <w:t xml:space="preserve">he code integration plan will encourage teams to </w:t>
             </w:r>
             <w:r>
               <w:rPr>
@@ -1560,15 +1552,14 @@
                 <w:sz w:val="17"/>
                 <w:szCs w:val="17"/>
               </w:rPr>
-              <w:t xml:space="preserve"> which will create higher quality code. </w:t>
-            </w:r>
-            <w:r>
-              <w:rPr>
-                <w:sz w:val="17"/>
-                <w:szCs w:val="17"/>
-              </w:rPr>
-              <w:lastRenderedPageBreak/>
-              <w:t xml:space="preserve">Reduced component delays will improve team collaboration.  </w:t>
+              <w:t>s</w:t>
+            </w:r>
+            <w:r>
+              <w:rPr>
+                <w:sz w:val="17"/>
+                <w:szCs w:val="17"/>
+              </w:rPr>
+              <w:t xml:space="preserve"> which will create higher quality code. Reduced component delays will improve team collaboration.  </w:t>
             </w:r>
           </w:p>
         </w:tc>
@@ -1742,7 +1733,7 @@
                 <w:sz w:val="17"/>
                 <w:szCs w:val="17"/>
               </w:rPr>
-              <w:t xml:space="preserve">.  The buffer time will enhance the overall quality of the final product since unexpected issues and bugs will have an appropriate amount of time allocated to resolve them. </w:t>
+              <w:t xml:space="preserve">. The buffer time will enhance the overall quality of the final product since unexpected issues and bugs will have an appropriate amount of time allocated to resolve them. </w:t>
             </w:r>
           </w:p>
         </w:tc>
@@ -1775,15 +1766,6 @@
         </w:rPr>
         <w:t>3.2 Resource and Allocation Suggestions</w:t>
       </w:r>
-    </w:p>
-    <w:p>
-      <w:pPr>
-        <w:spacing w:after="160"/>
-        <w:rPr>
-          <w:sz w:val="17"/>
-          <w:szCs w:val="17"/>
-        </w:rPr>
-      </w:pPr>
     </w:p>
     <w:p>
       <w:pPr>
@@ -1890,7 +1872,21 @@
                 <w:sz w:val="17"/>
                 <w:szCs w:val="17"/>
               </w:rPr>
-              <w:t>This suggestion fall under Resource and Allocation Suggestions as well since it is suggesting additional tests and therefore resources to be used.</w:t>
+              <w:t xml:space="preserve">This suggestion </w:t>
+            </w:r>
+            <w:r>
+              <w:rPr>
+                <w:sz w:val="17"/>
+                <w:szCs w:val="17"/>
+              </w:rPr>
+              <w:t>falls</w:t>
+            </w:r>
+            <w:r>
+              <w:rPr>
+                <w:sz w:val="17"/>
+                <w:szCs w:val="17"/>
+              </w:rPr>
+              <w:t xml:space="preserve"> under Resource and Allocation Suggestions as well since it is suggesting additional tests and therefore resources to be used.</w:t>
             </w:r>
           </w:p>
         </w:tc>

</xml_diff>